<commit_message>
updated cv, added presentation
</commit_message>
<xml_diff>
--- a/CV_VidaK.docx
+++ b/CV_VidaK.docx
@@ -1,6 +1,6 @@
 
 <file path=word/document.xml><?xml version="1.0" encoding="utf-8"?>
-<w:document xmlns:wpc="http://schemas.microsoft.com/office/word/2010/wordprocessingCanvas" xmlns:cx="http://schemas.microsoft.com/office/drawing/2014/chartex" xmlns:cx1="http://schemas.microsoft.com/office/drawing/2015/9/8/chartex" xmlns:cx2="http://schemas.microsoft.com/office/drawing/2015/10/21/chartex" xmlns:cx3="http://schemas.microsoft.com/office/drawing/2016/5/9/chartex" xmlns:cx4="http://schemas.microsoft.com/office/drawing/2016/5/10/chartex" xmlns:cx5="http://schemas.microsoft.com/office/drawing/2016/5/11/chartex" xmlns:cx6="http://schemas.microsoft.com/office/drawing/2016/5/12/chartex" xmlns:cx7="http://schemas.microsoft.com/office/drawing/2016/5/13/chartex" xmlns:cx8="http://schemas.microsoft.com/office/drawing/2016/5/14/chartex" xmlns:mc="http://schemas.openxmlformats.org/markup-compatibility/2006" xmlns:aink="http://schemas.microsoft.com/office/drawing/2016/ink" xmlns:am3d="http://schemas.microsoft.com/office/drawing/2017/model3d" xmlns:o="urn:schemas-microsoft-com:office:office" xmlns:oel="http://schemas.microsoft.com/office/2019/extlst" xmlns:r="http://schemas.openxmlformats.org/officeDocument/2006/relationships" xmlns:m="http://schemas.openxmlformats.org/officeDocument/2006/math" xmlns:v="urn:schemas-microsoft-com:vml" xmlns:wp14="http://schemas.microsoft.com/office/word/2010/wordprocessingDrawing" xmlns:wp="http://schemas.openxmlformats.org/drawingml/2006/wordprocessingDrawing" xmlns:w10="urn:schemas-microsoft-com:office:word" xmlns:w="http://schemas.openxmlformats.org/wordprocessingml/2006/main" xmlns:w14="http://schemas.microsoft.com/office/word/2010/wordml" xmlns:w15="http://schemas.microsoft.com/office/word/2012/wordml" xmlns:w16cex="http://schemas.microsoft.com/office/word/2018/wordml/cex" xmlns:w16cid="http://schemas.microsoft.com/office/word/2016/wordml/cid" xmlns:w16="http://schemas.microsoft.com/office/word/2018/wordml" xmlns:w16du="http://schemas.microsoft.com/office/word/2023/wordml/word16du" xmlns:w16sdtdh="http://schemas.microsoft.com/office/word/2020/wordml/sdtdatahash" xmlns:w16se="http://schemas.microsoft.com/office/word/2015/wordml/symex" xmlns:wpg="http://schemas.microsoft.com/office/word/2010/wordprocessingGroup" xmlns:wpi="http://schemas.microsoft.com/office/word/2010/wordprocessingInk" xmlns:wne="http://schemas.microsoft.com/office/word/2006/wordml" xmlns:wps="http://schemas.microsoft.com/office/word/2010/wordprocessingShape" mc:Ignorable="w14 w15 w16se w16cid w16 w16cex w16sdtdh w16du wp14">
+<w:document xmlns:wpc="http://schemas.microsoft.com/office/word/2010/wordprocessingCanvas" xmlns:cx="http://schemas.microsoft.com/office/drawing/2014/chartex" xmlns:cx1="http://schemas.microsoft.com/office/drawing/2015/9/8/chartex" xmlns:cx2="http://schemas.microsoft.com/office/drawing/2015/10/21/chartex" xmlns:cx3="http://schemas.microsoft.com/office/drawing/2016/5/9/chartex" xmlns:cx4="http://schemas.microsoft.com/office/drawing/2016/5/10/chartex" xmlns:cx5="http://schemas.microsoft.com/office/drawing/2016/5/11/chartex" xmlns:cx6="http://schemas.microsoft.com/office/drawing/2016/5/12/chartex" xmlns:cx7="http://schemas.microsoft.com/office/drawing/2016/5/13/chartex" xmlns:cx8="http://schemas.microsoft.com/office/drawing/2016/5/14/chartex" xmlns:mc="http://schemas.openxmlformats.org/markup-compatibility/2006" xmlns:aink="http://schemas.microsoft.com/office/drawing/2016/ink" xmlns:am3d="http://schemas.microsoft.com/office/drawing/2017/model3d" xmlns:o="urn:schemas-microsoft-com:office:office" xmlns:oel="http://schemas.microsoft.com/office/2019/extlst" xmlns:r="http://schemas.openxmlformats.org/officeDocument/2006/relationships" xmlns:m="http://schemas.openxmlformats.org/officeDocument/2006/math" xmlns:v="urn:schemas-microsoft-com:vml" xmlns:wp14="http://schemas.microsoft.com/office/word/2010/wordprocessingDrawing" xmlns:wp="http://schemas.openxmlformats.org/drawingml/2006/wordprocessingDrawing" xmlns:w10="urn:schemas-microsoft-com:office:word" xmlns:w="http://schemas.openxmlformats.org/wordprocessingml/2006/main" xmlns:w14="http://schemas.microsoft.com/office/word/2010/wordml" xmlns:w15="http://schemas.microsoft.com/office/word/2012/wordml" xmlns:w16cex="http://schemas.microsoft.com/office/word/2018/wordml/cex" xmlns:w16cid="http://schemas.microsoft.com/office/word/2016/wordml/cid" xmlns:w16="http://schemas.microsoft.com/office/word/2018/wordml" xmlns:w16du="http://schemas.microsoft.com/office/word/2023/wordml/word16du" xmlns:w16sdtdh="http://schemas.microsoft.com/office/word/2020/wordml/sdtdatahash" xmlns:w16sdtfl="http://schemas.microsoft.com/office/word/2024/wordml/sdtformatlock" xmlns:w16se="http://schemas.microsoft.com/office/word/2015/wordml/symex" xmlns:wpg="http://schemas.microsoft.com/office/word/2010/wordprocessingGroup" xmlns:wpi="http://schemas.microsoft.com/office/word/2010/wordprocessingInk" xmlns:wne="http://schemas.microsoft.com/office/word/2006/wordml" xmlns:wps="http://schemas.microsoft.com/office/word/2010/wordprocessingShape" mc:Ignorable="w14 w15 w16se w16cid w16 w16cex w16sdtdh w16sdtfl w16du wp14">
   <w:body>
     <w:p>
       <w:pPr>
@@ -277,14 +277,132 @@
         </w:rPr>
         <w:tab/>
       </w:r>
-      <w:r>
-        <w:rPr>
-          <w:rFonts w:ascii="Times New Roman" w:hAnsi="Times New Roman" w:cs="Times New Roman"/>
-          <w:sz w:val="22"/>
-          <w:szCs w:val="22"/>
-          <w:lang w:val="en-US"/>
-        </w:rPr>
-        <w:t>https://stark.konkoly.hu/vidak.html</w:t>
+      <w:hyperlink r:id="rId5" w:history="1">
+        <w:r>
+          <w:rPr>
+            <w:rStyle w:val="Hyperlink"/>
+            <w:rFonts w:ascii="Times New Roman" w:hAnsi="Times New Roman" w:cs="Times New Roman"/>
+            <w:sz w:val="22"/>
+            <w:szCs w:val="22"/>
+            <w:lang w:val="en-US"/>
+          </w:rPr>
+          <w:t>https://stark.konkoly.hu/vidak.html</w:t>
+        </w:r>
+      </w:hyperlink>
+    </w:p>
+    <w:p>
+      <w:pPr>
+        <w:widowControl w:val="0"/>
+        <w:autoSpaceDE w:val="0"/>
+        <w:autoSpaceDN w:val="0"/>
+        <w:adjustRightInd w:val="0"/>
+        <w:ind w:right="78"/>
+        <w:rPr>
+          <w:rFonts w:ascii="Times New Roman" w:hAnsi="Times New Roman" w:cs="Times New Roman"/>
+          <w:sz w:val="22"/>
+          <w:szCs w:val="22"/>
+          <w:lang w:val="en-US"/>
+        </w:rPr>
+      </w:pPr>
+      <w:r>
+        <w:rPr>
+          <w:rFonts w:ascii="Times New Roman" w:hAnsi="Times New Roman" w:cs="Times New Roman"/>
+          <w:sz w:val="22"/>
+          <w:szCs w:val="22"/>
+          <w:lang w:val="en-US"/>
+        </w:rPr>
+        <w:tab/>
+      </w:r>
+      <w:r>
+        <w:rPr>
+          <w:rFonts w:ascii="Times New Roman" w:hAnsi="Times New Roman" w:cs="Times New Roman"/>
+          <w:sz w:val="22"/>
+          <w:szCs w:val="22"/>
+          <w:lang w:val="en-US"/>
+        </w:rPr>
+        <w:tab/>
+      </w:r>
+      <w:r>
+        <w:rPr>
+          <w:rFonts w:ascii="Times New Roman" w:hAnsi="Times New Roman" w:cs="Times New Roman"/>
+          <w:sz w:val="22"/>
+          <w:szCs w:val="22"/>
+          <w:lang w:val="en-US"/>
+        </w:rPr>
+        <w:tab/>
+      </w:r>
+      <w:r>
+        <w:rPr>
+          <w:rFonts w:ascii="Times New Roman" w:hAnsi="Times New Roman" w:cs="Times New Roman"/>
+          <w:sz w:val="22"/>
+          <w:szCs w:val="22"/>
+          <w:lang w:val="en-US"/>
+        </w:rPr>
+        <w:tab/>
+      </w:r>
+      <w:r>
+        <w:rPr>
+          <w:rFonts w:ascii="Times New Roman" w:hAnsi="Times New Roman" w:cs="Times New Roman"/>
+          <w:sz w:val="22"/>
+          <w:szCs w:val="22"/>
+          <w:lang w:val="en-US"/>
+        </w:rPr>
+        <w:fldChar w:fldCharType="begin"/>
+      </w:r>
+      <w:r>
+        <w:rPr>
+          <w:rFonts w:ascii="Times New Roman" w:hAnsi="Times New Roman" w:cs="Times New Roman"/>
+          <w:sz w:val="22"/>
+          <w:szCs w:val="22"/>
+          <w:lang w:val="en-US"/>
+        </w:rPr>
+        <w:instrText>HYPERLINK "</w:instrText>
+      </w:r>
+      <w:r>
+        <w:rPr>
+          <w:rFonts w:ascii="Times New Roman" w:hAnsi="Times New Roman" w:cs="Times New Roman"/>
+          <w:sz w:val="22"/>
+          <w:szCs w:val="22"/>
+          <w:lang w:val="en-US"/>
+        </w:rPr>
+        <w:instrText>https://vidakris.github.io/</w:instrText>
+      </w:r>
+      <w:r>
+        <w:rPr>
+          <w:rFonts w:ascii="Times New Roman" w:hAnsi="Times New Roman" w:cs="Times New Roman"/>
+          <w:sz w:val="22"/>
+          <w:szCs w:val="22"/>
+          <w:lang w:val="en-US"/>
+        </w:rPr>
+        <w:instrText>"</w:instrText>
+      </w:r>
+      <w:r>
+        <w:rPr>
+          <w:rFonts w:ascii="Times New Roman" w:hAnsi="Times New Roman" w:cs="Times New Roman"/>
+          <w:sz w:val="22"/>
+          <w:szCs w:val="22"/>
+          <w:lang w:val="en-US"/>
+        </w:rPr>
+        <w:fldChar w:fldCharType="separate"/>
+      </w:r>
+      <w:r>
+        <w:rPr>
+          <w:rStyle w:val="Hyperlink"/>
+          <w:rFonts w:ascii="Times New Roman" w:hAnsi="Times New Roman" w:cs="Times New Roman"/>
+          <w:sz w:val="22"/>
+          <w:szCs w:val="22"/>
+          <w:lang w:val="en-US"/>
+        </w:rPr>
+        <w:t>https://vidakris.github.io/</w:t>
+      </w:r>
+      <w:r>
+        <w:rPr>
+          <w:rFonts w:ascii="Times New Roman" w:hAnsi="Times New Roman" w:cs="Times New Roman"/>
+          <w:sz w:val="22"/>
+          <w:szCs w:val="22"/>
+          <w:lang w:val="en-US"/>
+        </w:rPr>
+        <w:fldChar w:fldCharType="end"/>
       </w:r>
     </w:p>
     <w:p>
@@ -362,27 +480,7 @@
           <w:lang w:val="en-US"/>
         </w:rPr>
         <w:tab/>
-        <w:t xml:space="preserve">PhD degree, Eötvös </w:t>
-      </w:r>
-      <w:proofErr w:type="spellStart"/>
-      <w:r>
-        <w:rPr>
-          <w:rFonts w:ascii="Times New Roman" w:hAnsi="Times New Roman" w:cs="Times New Roman"/>
-          <w:sz w:val="22"/>
-          <w:szCs w:val="22"/>
-          <w:lang w:val="en-US"/>
-        </w:rPr>
-        <w:t>Loránd</w:t>
-      </w:r>
-      <w:proofErr w:type="spellEnd"/>
-      <w:r>
-        <w:rPr>
-          <w:rFonts w:ascii="Times New Roman" w:hAnsi="Times New Roman" w:cs="Times New Roman"/>
-          <w:sz w:val="22"/>
-          <w:szCs w:val="22"/>
-          <w:lang w:val="en-US"/>
-        </w:rPr>
-        <w:t xml:space="preserve"> University (</w:t>
+        <w:t>PhD degree, Eötvös Loránd University (</w:t>
       </w:r>
       <w:r>
         <w:rPr>
@@ -411,19 +509,8 @@
           <w:szCs w:val="22"/>
           <w:lang w:val="en-US"/>
         </w:rPr>
-        <w:t xml:space="preserve">, advisor: K. </w:t>
-      </w:r>
-      <w:proofErr w:type="spellStart"/>
-      <w:r>
-        <w:rPr>
-          <w:rFonts w:ascii="Times New Roman" w:hAnsi="Times New Roman" w:cs="Times New Roman"/>
-          <w:sz w:val="22"/>
-          <w:szCs w:val="22"/>
-          <w:lang w:val="en-US"/>
-        </w:rPr>
-        <w:t>Oláh</w:t>
-      </w:r>
-      <w:proofErr w:type="spellEnd"/>
+        <w:t>, advisor: K. Oláh</w:t>
+      </w:r>
       <w:r>
         <w:rPr>
           <w:rFonts w:ascii="Times New Roman" w:hAnsi="Times New Roman" w:cs="Times New Roman"/>
@@ -465,27 +552,7 @@
           <w:lang w:val="en-US"/>
         </w:rPr>
         <w:tab/>
-        <w:t xml:space="preserve">Eötvös </w:t>
-      </w:r>
-      <w:proofErr w:type="spellStart"/>
-      <w:r>
-        <w:rPr>
-          <w:rFonts w:ascii="Times New Roman" w:hAnsi="Times New Roman" w:cs="Times New Roman"/>
-          <w:sz w:val="22"/>
-          <w:szCs w:val="22"/>
-          <w:lang w:val="en-US"/>
-        </w:rPr>
-        <w:t>Loránd</w:t>
-      </w:r>
-      <w:proofErr w:type="spellEnd"/>
-      <w:r>
-        <w:rPr>
-          <w:rFonts w:ascii="Times New Roman" w:hAnsi="Times New Roman" w:cs="Times New Roman"/>
-          <w:sz w:val="22"/>
-          <w:szCs w:val="22"/>
-          <w:lang w:val="en-US"/>
-        </w:rPr>
-        <w:t xml:space="preserve"> University, PhD school (Particle physics and Astronomy)</w:t>
+        <w:t>Eötvös Loránd University, PhD school (Particle physics and Astronomy)</w:t>
       </w:r>
     </w:p>
     <w:p>
@@ -519,27 +586,7 @@
           <w:lang w:val="en-US"/>
         </w:rPr>
         <w:tab/>
-        <w:t xml:space="preserve">Eötvös </w:t>
-      </w:r>
-      <w:proofErr w:type="spellStart"/>
-      <w:r>
-        <w:rPr>
-          <w:rFonts w:ascii="Times New Roman" w:hAnsi="Times New Roman" w:cs="Times New Roman"/>
-          <w:sz w:val="22"/>
-          <w:szCs w:val="22"/>
-          <w:lang w:val="en-US"/>
-        </w:rPr>
-        <w:t>Loránd</w:t>
-      </w:r>
-      <w:proofErr w:type="spellEnd"/>
-      <w:r>
-        <w:rPr>
-          <w:rFonts w:ascii="Times New Roman" w:hAnsi="Times New Roman" w:cs="Times New Roman"/>
-          <w:sz w:val="22"/>
-          <w:szCs w:val="22"/>
-          <w:lang w:val="en-US"/>
-        </w:rPr>
-        <w:t xml:space="preserve"> University, astronomy (MSc</w:t>
+        <w:t>Eötvös Loránd University, astronomy (MSc</w:t>
       </w:r>
       <w:r>
         <w:rPr>
@@ -577,19 +624,8 @@
           <w:szCs w:val="22"/>
           <w:lang w:val="en-US"/>
         </w:rPr>
-        <w:t xml:space="preserve">advisor: K. </w:t>
-      </w:r>
-      <w:proofErr w:type="spellStart"/>
-      <w:r>
-        <w:rPr>
-          <w:rFonts w:ascii="Times New Roman" w:hAnsi="Times New Roman" w:cs="Times New Roman"/>
-          <w:sz w:val="22"/>
-          <w:szCs w:val="22"/>
-          <w:lang w:val="en-US"/>
-        </w:rPr>
-        <w:t>Oláh</w:t>
-      </w:r>
-      <w:proofErr w:type="spellEnd"/>
+        <w:t>advisor: K. Oláh</w:t>
+      </w:r>
       <w:r>
         <w:rPr>
           <w:rFonts w:ascii="Times New Roman" w:hAnsi="Times New Roman" w:cs="Times New Roman"/>
@@ -829,27 +865,7 @@
           <w:lang w:val="en-US"/>
         </w:rPr>
         <w:tab/>
-        <w:t xml:space="preserve">Eötvös </w:t>
-      </w:r>
-      <w:proofErr w:type="spellStart"/>
-      <w:r>
-        <w:rPr>
-          <w:rFonts w:ascii="Times New Roman" w:hAnsi="Times New Roman" w:cs="Times New Roman"/>
-          <w:sz w:val="22"/>
-          <w:szCs w:val="22"/>
-          <w:lang w:val="en-US"/>
-        </w:rPr>
-        <w:t>Loránd</w:t>
-      </w:r>
-      <w:proofErr w:type="spellEnd"/>
-      <w:r>
-        <w:rPr>
-          <w:rFonts w:ascii="Times New Roman" w:hAnsi="Times New Roman" w:cs="Times New Roman"/>
-          <w:sz w:val="22"/>
-          <w:szCs w:val="22"/>
-          <w:lang w:val="en-US"/>
-        </w:rPr>
-        <w:t xml:space="preserve"> University, PhD student</w:t>
+        <w:t>Eötvös Loránd University, PhD student</w:t>
       </w:r>
     </w:p>
     <w:p>
@@ -936,55 +952,137 @@
         <w:autoSpaceDE w:val="0"/>
         <w:autoSpaceDN w:val="0"/>
         <w:adjustRightInd w:val="0"/>
-        <w:ind w:left="1440" w:right="78" w:hanging="1440"/>
+        <w:ind w:left="1418" w:right="78" w:hanging="1418"/>
+        <w:jc w:val="both"/>
+        <w:rPr>
+          <w:rFonts w:ascii="Times New Roman" w:hAnsi="Times New Roman" w:cs="Times New Roman"/>
+          <w:sz w:val="22"/>
+          <w:szCs w:val="22"/>
+          <w:lang w:val="en-US"/>
+        </w:rPr>
+      </w:pPr>
+      <w:r>
+        <w:rPr>
+          <w:rFonts w:ascii="Times New Roman" w:hAnsi="Times New Roman" w:cs="Times New Roman"/>
+          <w:sz w:val="22"/>
+          <w:szCs w:val="22"/>
+          <w:lang w:val="en-US"/>
+        </w:rPr>
+        <w:t xml:space="preserve">2025 </w:t>
+      </w:r>
+      <w:r>
+        <w:rPr>
+          <w:rFonts w:ascii="Times New Roman" w:hAnsi="Times New Roman" w:cs="Times New Roman"/>
+          <w:sz w:val="22"/>
+          <w:szCs w:val="22"/>
+          <w:lang w:val="en-US"/>
+        </w:rPr>
+        <w:tab/>
+      </w:r>
+      <w:r>
+        <w:rPr>
+          <w:rFonts w:ascii="Times New Roman" w:hAnsi="Times New Roman" w:cs="Times New Roman"/>
+          <w:sz w:val="22"/>
+          <w:szCs w:val="22"/>
+          <w:lang w:val="en-US"/>
+        </w:rPr>
+        <w:tab/>
+      </w:r>
+      <w:r>
+        <w:rPr>
+          <w:rFonts w:ascii="Times New Roman" w:hAnsi="Times New Roman" w:cs="Times New Roman"/>
+          <w:sz w:val="22"/>
+          <w:szCs w:val="22"/>
+          <w:lang w:val="en-US"/>
+        </w:rPr>
+        <w:t>Bolyai commemorative certificate (for receiving a final report with an "outstanding" rating)</w:t>
+      </w:r>
+    </w:p>
+    <w:p>
+      <w:pPr>
+        <w:widowControl w:val="0"/>
+        <w:autoSpaceDE w:val="0"/>
+        <w:autoSpaceDN w:val="0"/>
+        <w:adjustRightInd w:val="0"/>
+        <w:ind w:left="1418" w:right="78" w:hanging="1418"/>
+        <w:jc w:val="both"/>
+        <w:rPr>
+          <w:rFonts w:ascii="Times New Roman" w:hAnsi="Times New Roman" w:cs="Times New Roman"/>
+          <w:sz w:val="22"/>
+          <w:szCs w:val="22"/>
+          <w:lang w:val="en-US"/>
+        </w:rPr>
+      </w:pPr>
+      <w:proofErr w:type="gramStart"/>
+      <w:r>
+        <w:rPr>
+          <w:rFonts w:ascii="Times New Roman" w:hAnsi="Times New Roman" w:cs="Times New Roman"/>
+          <w:sz w:val="22"/>
+          <w:szCs w:val="22"/>
+          <w:lang w:val="en-US"/>
+        </w:rPr>
+        <w:t xml:space="preserve">2023  </w:t>
+      </w:r>
+      <w:r>
+        <w:rPr>
+          <w:rFonts w:ascii="Times New Roman" w:hAnsi="Times New Roman" w:cs="Times New Roman"/>
+          <w:sz w:val="22"/>
+          <w:szCs w:val="22"/>
+          <w:lang w:val="en-US"/>
+        </w:rPr>
+        <w:tab/>
+      </w:r>
+      <w:proofErr w:type="gramEnd"/>
+      <w:r>
+        <w:rPr>
+          <w:rFonts w:ascii="Times New Roman" w:hAnsi="Times New Roman" w:cs="Times New Roman"/>
+          <w:sz w:val="22"/>
+          <w:szCs w:val="22"/>
+          <w:lang w:val="en-US"/>
+        </w:rPr>
+        <w:t>“</w:t>
+      </w:r>
+      <w:proofErr w:type="gramStart"/>
+      <w:r>
+        <w:rPr>
+          <w:rFonts w:ascii="Times New Roman" w:hAnsi="Times New Roman" w:cs="Times New Roman"/>
+          <w:sz w:val="22"/>
+          <w:szCs w:val="22"/>
+          <w:lang w:val="en-US"/>
+        </w:rPr>
+        <w:t>Austrian–Hungarian</w:t>
+      </w:r>
+      <w:proofErr w:type="gramEnd"/>
+      <w:r>
+        <w:rPr>
+          <w:rFonts w:ascii="Times New Roman" w:hAnsi="Times New Roman" w:cs="Times New Roman"/>
+          <w:sz w:val="22"/>
+          <w:szCs w:val="22"/>
+          <w:lang w:val="en-US"/>
+        </w:rPr>
+        <w:t xml:space="preserve"> Action Foundation” grant</w:t>
+      </w:r>
+      <w:r>
+        <w:rPr>
+          <w:rFonts w:ascii="Times New Roman" w:hAnsi="Times New Roman" w:cs="Times New Roman"/>
+          <w:sz w:val="22"/>
+          <w:szCs w:val="22"/>
+          <w:lang w:val="en-US"/>
+        </w:rPr>
+        <w:t xml:space="preserve"> (</w:t>
+      </w:r>
+      <w:r>
         <w:rPr>
           <w:rFonts w:ascii="Times New Roman" w:hAnsi="Times New Roman" w:cs="Times New Roman"/>
           <w:i/>
           <w:iCs/>
           <w:sz w:val="22"/>
           <w:szCs w:val="22"/>
-          <w:lang w:val="en-HU"/>
-        </w:rPr>
-      </w:pPr>
-      <w:r>
-        <w:rPr>
-          <w:rFonts w:ascii="Times New Roman" w:hAnsi="Times New Roman" w:cs="Times New Roman"/>
-          <w:sz w:val="22"/>
-          <w:szCs w:val="22"/>
-          <w:lang w:val="en-US"/>
-        </w:rPr>
-        <w:t>2022–</w:t>
-      </w:r>
-      <w:r>
-        <w:rPr>
-          <w:rFonts w:ascii="Times New Roman" w:hAnsi="Times New Roman" w:cs="Times New Roman"/>
-          <w:sz w:val="22"/>
-          <w:szCs w:val="22"/>
-          <w:lang w:val="en-US"/>
-        </w:rPr>
-        <w:tab/>
-        <w:t>“</w:t>
+          <w:lang w:val="en-US"/>
+        </w:rPr>
+        <w:t xml:space="preserve">Superflares auf der Sonne und auf </w:t>
       </w:r>
       <w:proofErr w:type="spellStart"/>
-      <w:r>
-        <w:rPr>
-          <w:rFonts w:ascii="Times New Roman" w:hAnsi="Times New Roman" w:cs="Times New Roman"/>
-          <w:sz w:val="22"/>
-          <w:szCs w:val="22"/>
-          <w:lang w:val="en-US"/>
-        </w:rPr>
-        <w:t>Élvonal</w:t>
-      </w:r>
-      <w:proofErr w:type="spellEnd"/>
-      <w:r>
-        <w:rPr>
-          <w:rFonts w:ascii="Times New Roman" w:hAnsi="Times New Roman" w:cs="Times New Roman"/>
-          <w:sz w:val="22"/>
-          <w:szCs w:val="22"/>
-          <w:lang w:val="en-US"/>
-        </w:rPr>
-        <w:t>” grant (</w:t>
-      </w:r>
       <w:r>
         <w:rPr>
           <w:rFonts w:ascii="Times New Roman" w:hAnsi="Times New Roman" w:cs="Times New Roman"/>
@@ -994,8 +1092,9 @@
           <w:szCs w:val="22"/>
           <w:lang w:val="en-US"/>
         </w:rPr>
-        <w:t>Living with an active star - the impac</w:t>
-      </w:r>
+        <w:t>Sternen</w:t>
+      </w:r>
+      <w:proofErr w:type="spellEnd"/>
       <w:r>
         <w:rPr>
           <w:rFonts w:ascii="Times New Roman" w:hAnsi="Times New Roman" w:cs="Times New Roman"/>
@@ -1005,7 +1104,7 @@
           <w:szCs w:val="22"/>
           <w:lang w:val="en-US"/>
         </w:rPr>
-        <w:t>t</w:t>
+        <w:t>:</w:t>
       </w:r>
       <w:r>
         <w:rPr>
@@ -1016,8 +1115,9 @@
           <w:szCs w:val="22"/>
           <w:lang w:val="en-US"/>
         </w:rPr>
-        <w:t xml:space="preserve"> of stellar activity on exoplanetary habitability</w:t>
-      </w:r>
+        <w:t xml:space="preserve"> </w:t>
+      </w:r>
+      <w:proofErr w:type="spellStart"/>
       <w:r>
         <w:rPr>
           <w:rFonts w:ascii="Times New Roman" w:hAnsi="Times New Roman" w:cs="Times New Roman"/>
@@ -1027,6 +1127,203 @@
           <w:szCs w:val="22"/>
           <w:lang w:val="en-US"/>
         </w:rPr>
+        <w:t>Risiken</w:t>
+      </w:r>
+      <w:proofErr w:type="spellEnd"/>
+      <w:r>
+        <w:rPr>
+          <w:rFonts w:ascii="Times New Roman" w:hAnsi="Times New Roman" w:cs="Times New Roman"/>
+          <w:i/>
+          <w:iCs/>
+          <w:sz w:val="22"/>
+          <w:szCs w:val="22"/>
+          <w:lang w:val="en-US"/>
+        </w:rPr>
+        <w:t xml:space="preserve"> und </w:t>
+      </w:r>
+      <w:proofErr w:type="spellStart"/>
+      <w:r>
+        <w:rPr>
+          <w:rFonts w:ascii="Times New Roman" w:hAnsi="Times New Roman" w:cs="Times New Roman"/>
+          <w:i/>
+          <w:iCs/>
+          <w:sz w:val="22"/>
+          <w:szCs w:val="22"/>
+          <w:lang w:val="en-US"/>
+        </w:rPr>
+        <w:t>Konsequenzen</w:t>
+      </w:r>
+      <w:proofErr w:type="spellEnd"/>
+      <w:r>
+        <w:rPr>
+          <w:rFonts w:ascii="Times New Roman" w:hAnsi="Times New Roman" w:cs="Times New Roman"/>
+          <w:sz w:val="22"/>
+          <w:szCs w:val="22"/>
+          <w:lang w:val="en-US"/>
+        </w:rPr>
+        <w:t xml:space="preserve">, </w:t>
+      </w:r>
+      <w:r>
+        <w:rPr>
+          <w:rFonts w:ascii="Times New Roman" w:hAnsi="Times New Roman" w:cs="Times New Roman"/>
+          <w:sz w:val="22"/>
+          <w:szCs w:val="22"/>
+          <w:lang w:val="en-US"/>
+        </w:rPr>
+        <w:t>~</w:t>
+      </w:r>
+      <w:r>
+        <w:rPr>
+          <w:rFonts w:ascii="Times New Roman" w:hAnsi="Times New Roman" w:cs="Times New Roman"/>
+          <w:sz w:val="22"/>
+          <w:szCs w:val="22"/>
+          <w:lang w:val="en-US"/>
+        </w:rPr>
+        <w:t>11</w:t>
+      </w:r>
+      <w:r>
+        <w:rPr>
+          <w:rFonts w:ascii="Times New Roman" w:hAnsi="Times New Roman" w:cs="Times New Roman"/>
+          <w:sz w:val="22"/>
+          <w:szCs w:val="22"/>
+          <w:lang w:val="en-US"/>
+        </w:rPr>
+        <w:t xml:space="preserve"> </w:t>
+      </w:r>
+      <w:r>
+        <w:rPr>
+          <w:rFonts w:ascii="Times New Roman" w:hAnsi="Times New Roman" w:cs="Times New Roman"/>
+          <w:sz w:val="22"/>
+          <w:szCs w:val="22"/>
+          <w:lang w:val="en-US"/>
+        </w:rPr>
+        <w:t>000</w:t>
+      </w:r>
+      <w:r>
+        <w:rPr>
+          <w:rFonts w:ascii="Times New Roman" w:hAnsi="Times New Roman" w:cs="Times New Roman"/>
+          <w:sz w:val="22"/>
+          <w:szCs w:val="22"/>
+          <w:lang w:val="en-US"/>
+        </w:rPr>
+        <w:t>€</w:t>
+      </w:r>
+      <w:r>
+        <w:rPr>
+          <w:rFonts w:ascii="Times New Roman" w:hAnsi="Times New Roman" w:cs="Times New Roman"/>
+          <w:sz w:val="22"/>
+          <w:szCs w:val="22"/>
+          <w:lang w:val="en-US"/>
+        </w:rPr>
+        <w:t>)</w:t>
+      </w:r>
+    </w:p>
+    <w:p>
+      <w:pPr>
+        <w:widowControl w:val="0"/>
+        <w:autoSpaceDE w:val="0"/>
+        <w:autoSpaceDN w:val="0"/>
+        <w:adjustRightInd w:val="0"/>
+        <w:ind w:left="1440" w:right="78" w:hanging="1440"/>
+        <w:rPr>
+          <w:rFonts w:ascii="Times New Roman" w:hAnsi="Times New Roman" w:cs="Times New Roman"/>
+          <w:i/>
+          <w:iCs/>
+          <w:sz w:val="22"/>
+          <w:szCs w:val="22"/>
+          <w:lang w:val="en-US"/>
+        </w:rPr>
+      </w:pPr>
+      <w:r>
+        <w:rPr>
+          <w:rFonts w:ascii="Times New Roman" w:hAnsi="Times New Roman" w:cs="Times New Roman"/>
+          <w:sz w:val="22"/>
+          <w:szCs w:val="22"/>
+          <w:lang w:val="en-US"/>
+        </w:rPr>
+        <w:t>2022–</w:t>
+      </w:r>
+      <w:r>
+        <w:rPr>
+          <w:rFonts w:ascii="Times New Roman" w:hAnsi="Times New Roman" w:cs="Times New Roman"/>
+          <w:sz w:val="22"/>
+          <w:szCs w:val="22"/>
+          <w:lang w:val="en-US"/>
+        </w:rPr>
+        <w:t>2027</w:t>
+      </w:r>
+      <w:r>
+        <w:rPr>
+          <w:rFonts w:ascii="Times New Roman" w:hAnsi="Times New Roman" w:cs="Times New Roman"/>
+          <w:sz w:val="22"/>
+          <w:szCs w:val="22"/>
+          <w:lang w:val="en-US"/>
+        </w:rPr>
+        <w:tab/>
+        <w:t>“</w:t>
+      </w:r>
+      <w:proofErr w:type="spellStart"/>
+      <w:r>
+        <w:rPr>
+          <w:rFonts w:ascii="Times New Roman" w:hAnsi="Times New Roman" w:cs="Times New Roman"/>
+          <w:sz w:val="22"/>
+          <w:szCs w:val="22"/>
+          <w:lang w:val="en-US"/>
+        </w:rPr>
+        <w:t>Élvonal</w:t>
+      </w:r>
+      <w:proofErr w:type="spellEnd"/>
+      <w:r>
+        <w:rPr>
+          <w:rFonts w:ascii="Times New Roman" w:hAnsi="Times New Roman" w:cs="Times New Roman"/>
+          <w:sz w:val="22"/>
+          <w:szCs w:val="22"/>
+          <w:lang w:val="en-US"/>
+        </w:rPr>
+        <w:t>” grant (</w:t>
+      </w:r>
+      <w:r>
+        <w:rPr>
+          <w:rFonts w:ascii="Times New Roman" w:hAnsi="Times New Roman" w:cs="Times New Roman"/>
+          <w:i/>
+          <w:iCs/>
+          <w:sz w:val="22"/>
+          <w:szCs w:val="22"/>
+          <w:lang w:val="en-US"/>
+        </w:rPr>
+        <w:t>Living with an active star - the impac</w:t>
+      </w:r>
+      <w:r>
+        <w:rPr>
+          <w:rFonts w:ascii="Times New Roman" w:hAnsi="Times New Roman" w:cs="Times New Roman"/>
+          <w:i/>
+          <w:iCs/>
+          <w:sz w:val="22"/>
+          <w:szCs w:val="22"/>
+          <w:lang w:val="en-US"/>
+        </w:rPr>
+        <w:t>t</w:t>
+      </w:r>
+      <w:r>
+        <w:rPr>
+          <w:rFonts w:ascii="Times New Roman" w:hAnsi="Times New Roman" w:cs="Times New Roman"/>
+          <w:i/>
+          <w:iCs/>
+          <w:sz w:val="22"/>
+          <w:szCs w:val="22"/>
+          <w:lang w:val="en-US"/>
+        </w:rPr>
+        <w:t xml:space="preserve"> of stellar activity on exoplanetary habitability</w:t>
+      </w:r>
+      <w:r>
+        <w:rPr>
+          <w:rFonts w:ascii="Times New Roman" w:hAnsi="Times New Roman" w:cs="Times New Roman"/>
+          <w:i/>
+          <w:iCs/>
+          <w:sz w:val="22"/>
+          <w:szCs w:val="22"/>
+          <w:lang w:val="en-US"/>
+        </w:rPr>
         <w:t>, ~815 000€)</w:t>
       </w:r>
     </w:p>
@@ -1041,6 +1338,58 @@
           <w:rFonts w:ascii="Times New Roman" w:hAnsi="Times New Roman" w:cs="Times New Roman"/>
           <w:sz w:val="22"/>
           <w:szCs w:val="22"/>
+          <w:lang w:val="en-HU"/>
+        </w:rPr>
+      </w:pPr>
+      <w:r>
+        <w:rPr>
+          <w:rFonts w:ascii="Times New Roman" w:hAnsi="Times New Roman" w:cs="Times New Roman"/>
+          <w:sz w:val="22"/>
+          <w:szCs w:val="22"/>
+          <w:lang w:val="en-US"/>
+        </w:rPr>
+        <w:t>2022</w:t>
+      </w:r>
+      <w:r>
+        <w:rPr>
+          <w:rFonts w:ascii="Times New Roman" w:hAnsi="Times New Roman" w:cs="Times New Roman"/>
+          <w:sz w:val="22"/>
+          <w:szCs w:val="22"/>
+          <w:lang w:val="en-US"/>
+        </w:rPr>
+        <w:tab/>
+        <w:t xml:space="preserve">Bolyai+ scholarship </w:t>
+      </w:r>
+      <w:r>
+        <w:rPr>
+          <w:rFonts w:ascii="Times New Roman" w:hAnsi="Times New Roman" w:cs="Times New Roman"/>
+          <w:sz w:val="22"/>
+          <w:szCs w:val="22"/>
+          <w:lang w:val="en-US"/>
+        </w:rPr>
+        <w:t>(to support outstanding researchers and promote scientific cooperation between the academy and universities</w:t>
+      </w:r>
+      <w:r>
+        <w:rPr>
+          <w:rFonts w:ascii="Times New Roman" w:hAnsi="Times New Roman" w:cs="Times New Roman"/>
+          <w:sz w:val="22"/>
+          <w:szCs w:val="22"/>
+          <w:lang w:val="en-US"/>
+        </w:rPr>
+        <w:t>)</w:t>
+      </w:r>
+    </w:p>
+    <w:p>
+      <w:pPr>
+        <w:widowControl w:val="0"/>
+        <w:autoSpaceDE w:val="0"/>
+        <w:autoSpaceDN w:val="0"/>
+        <w:adjustRightInd w:val="0"/>
+        <w:ind w:left="1440" w:right="78" w:hanging="1440"/>
+        <w:rPr>
+          <w:rFonts w:ascii="Times New Roman" w:hAnsi="Times New Roman" w:cs="Times New Roman"/>
+          <w:sz w:val="22"/>
+          <w:szCs w:val="22"/>
           <w:lang w:val="en-US"/>
         </w:rPr>
       </w:pPr>
@@ -1183,7 +1532,7 @@
         <w:autoSpaceDE w:val="0"/>
         <w:autoSpaceDN w:val="0"/>
         <w:adjustRightInd w:val="0"/>
-        <w:ind w:left="720" w:right="78" w:hanging="720"/>
+        <w:ind w:left="1418" w:right="78" w:hanging="1418"/>
         <w:rPr>
           <w:rFonts w:ascii="Times New Roman" w:hAnsi="Times New Roman" w:cs="Times New Roman"/>
           <w:sz w:val="22"/>
@@ -1524,7 +1873,7 @@
         <w:autoSpaceDE w:val="0"/>
         <w:autoSpaceDN w:val="0"/>
         <w:adjustRightInd w:val="0"/>
-        <w:ind w:left="720" w:right="78" w:hanging="720"/>
+        <w:ind w:left="1418" w:right="78" w:hanging="1418"/>
         <w:rPr>
           <w:rFonts w:ascii="Times New Roman" w:hAnsi="Times New Roman" w:cs="Times New Roman"/>
           <w:sz w:val="22"/>
@@ -1729,7 +2078,7 @@
         <w:autoSpaceDE w:val="0"/>
         <w:autoSpaceDN w:val="0"/>
         <w:adjustRightInd w:val="0"/>
-        <w:ind w:right="78"/>
+        <w:ind w:left="1418" w:right="78" w:hanging="1418"/>
         <w:rPr>
           <w:rFonts w:ascii="Times New Roman" w:hAnsi="Times New Roman" w:cs="Times New Roman"/>
           <w:i/>
@@ -1782,7 +2131,27 @@
           <w:szCs w:val="22"/>
           <w:lang w:val="en-US"/>
         </w:rPr>
-        <w:t>“Austrian—Hungarian Action Foundation” grant (</w:t>
+        <w:t>“</w:t>
+      </w:r>
+      <w:proofErr w:type="gramStart"/>
+      <w:r>
+        <w:rPr>
+          <w:rFonts w:ascii="Times New Roman" w:hAnsi="Times New Roman" w:cs="Times New Roman"/>
+          <w:sz w:val="22"/>
+          <w:szCs w:val="22"/>
+          <w:lang w:val="en-US"/>
+        </w:rPr>
+        <w:t>Austrian—Hungarian</w:t>
+      </w:r>
+      <w:proofErr w:type="gramEnd"/>
+      <w:r>
+        <w:rPr>
+          <w:rFonts w:ascii="Times New Roman" w:hAnsi="Times New Roman" w:cs="Times New Roman"/>
+          <w:sz w:val="22"/>
+          <w:szCs w:val="22"/>
+          <w:lang w:val="en-US"/>
+        </w:rPr>
+        <w:t xml:space="preserve"> Action Foundation” grant (</w:t>
       </w:r>
       <w:r>
         <w:rPr>
@@ -1795,21 +2164,6 @@
         </w:rPr>
         <w:t>Characterizing space weather</w:t>
       </w:r>
-    </w:p>
-    <w:p>
-      <w:pPr>
-        <w:widowControl w:val="0"/>
-        <w:autoSpaceDE w:val="0"/>
-        <w:autoSpaceDN w:val="0"/>
-        <w:adjustRightInd w:val="0"/>
-        <w:ind w:left="720" w:right="78" w:firstLine="720"/>
-        <w:rPr>
-          <w:rFonts w:ascii="Times New Roman" w:hAnsi="Times New Roman" w:cs="Times New Roman"/>
-          <w:sz w:val="22"/>
-          <w:szCs w:val="22"/>
-          <w:lang w:val="en-US"/>
-        </w:rPr>
-      </w:pPr>
       <w:r>
         <w:rPr>
           <w:rFonts w:ascii="Times New Roman" w:hAnsi="Times New Roman" w:cs="Times New Roman"/>
@@ -1819,6 +2173,17 @@
           <w:szCs w:val="22"/>
           <w:lang w:val="en-US"/>
         </w:rPr>
+        <w:t xml:space="preserve"> </w:t>
+      </w:r>
+      <w:r>
+        <w:rPr>
+          <w:rFonts w:ascii="Times New Roman" w:hAnsi="Times New Roman" w:cs="Times New Roman"/>
+          <w:i/>
+          <w:iCs/>
+          <w:sz w:val="22"/>
+          <w:szCs w:val="22"/>
+          <w:lang w:val="en-US"/>
+        </w:rPr>
         <w:t>in extra-solar systems</w:t>
       </w:r>
       <w:r>
@@ -2063,25 +2428,47 @@
           <w:szCs w:val="22"/>
           <w:lang w:val="en-US"/>
         </w:rPr>
-        <w:t>Hungarian Academy of Sciences), three OTKA research grants, two further “Austrian—Hungarian Action Foundation” travel grants</w:t>
-      </w:r>
-    </w:p>
-    <w:p>
-      <w:pPr>
-        <w:widowControl w:val="0"/>
-        <w:autoSpaceDE w:val="0"/>
-        <w:autoSpaceDN w:val="0"/>
-        <w:adjustRightInd w:val="0"/>
-        <w:ind w:right="78"/>
-        <w:rPr>
-          <w:rFonts w:ascii="Times New Roman" w:hAnsi="Times New Roman" w:cs="Times New Roman"/>
-          <w:b/>
-          <w:bCs/>
-          <w:sz w:val="22"/>
-          <w:szCs w:val="22"/>
-          <w:lang w:val="en-US"/>
-        </w:rPr>
-      </w:pPr>
+        <w:t>Hungarian Academy of Sciences), three OTKA research grants, two further “</w:t>
+      </w:r>
+      <w:proofErr w:type="gramStart"/>
+      <w:r>
+        <w:rPr>
+          <w:rFonts w:ascii="Times New Roman" w:hAnsi="Times New Roman" w:cs="Times New Roman"/>
+          <w:sz w:val="22"/>
+          <w:szCs w:val="22"/>
+          <w:lang w:val="en-US"/>
+        </w:rPr>
+        <w:t>Austrian—Hungarian</w:t>
+      </w:r>
+      <w:proofErr w:type="gramEnd"/>
+      <w:r>
+        <w:rPr>
+          <w:rFonts w:ascii="Times New Roman" w:hAnsi="Times New Roman" w:cs="Times New Roman"/>
+          <w:sz w:val="22"/>
+          <w:szCs w:val="22"/>
+          <w:lang w:val="en-US"/>
+        </w:rPr>
+        <w:t xml:space="preserve"> Action Foundation” travel grants</w:t>
+      </w:r>
+    </w:p>
+    <w:p>
+      <w:pPr>
+        <w:rPr>
+          <w:rFonts w:ascii="Times New Roman" w:hAnsi="Times New Roman" w:cs="Times New Roman"/>
+          <w:sz w:val="22"/>
+          <w:szCs w:val="22"/>
+          <w:lang w:val="en-US"/>
+        </w:rPr>
+      </w:pPr>
+      <w:r>
+        <w:rPr>
+          <w:rFonts w:ascii="Times New Roman" w:hAnsi="Times New Roman" w:cs="Times New Roman"/>
+          <w:sz w:val="22"/>
+          <w:szCs w:val="22"/>
+          <w:lang w:val="en-US"/>
+        </w:rPr>
+        <w:br w:type="page"/>
+      </w:r>
     </w:p>
     <w:p>
       <w:pPr>
@@ -2112,6 +2499,7 @@
           <w:szCs w:val="22"/>
           <w:lang w:val="en-US"/>
         </w:rPr>
+        <w:lastRenderedPageBreak/>
         <w:t>REVIEWING ACTIVITIES</w:t>
       </w:r>
       <w:r>
@@ -2134,6 +2522,67 @@
         <w:autoSpaceDE w:val="0"/>
         <w:autoSpaceDN w:val="0"/>
         <w:adjustRightInd w:val="0"/>
+        <w:ind w:right="78"/>
+        <w:rPr>
+          <w:rFonts w:ascii="Times New Roman" w:hAnsi="Times New Roman" w:cs="Times New Roman"/>
+          <w:spacing w:val="2"/>
+          <w:kern w:val="1"/>
+          <w:sz w:val="22"/>
+          <w:szCs w:val="22"/>
+          <w:lang w:val="en-US"/>
+        </w:rPr>
+      </w:pPr>
+      <w:r>
+        <w:rPr>
+          <w:rFonts w:ascii="Times New Roman" w:hAnsi="Times New Roman" w:cs="Times New Roman"/>
+          <w:spacing w:val="2"/>
+          <w:kern w:val="1"/>
+          <w:sz w:val="22"/>
+          <w:szCs w:val="22"/>
+          <w:lang w:val="en-US"/>
+        </w:rPr>
+        <w:t>2025</w:t>
+      </w:r>
+      <w:r>
+        <w:rPr>
+          <w:rFonts w:ascii="Times New Roman" w:hAnsi="Times New Roman" w:cs="Times New Roman"/>
+          <w:spacing w:val="2"/>
+          <w:kern w:val="1"/>
+          <w:sz w:val="22"/>
+          <w:szCs w:val="22"/>
+          <w:lang w:val="en-US"/>
+        </w:rPr>
+        <w:tab/>
+      </w:r>
+      <w:r>
+        <w:rPr>
+          <w:rFonts w:ascii="Times New Roman" w:hAnsi="Times New Roman" w:cs="Times New Roman"/>
+          <w:spacing w:val="2"/>
+          <w:kern w:val="1"/>
+          <w:sz w:val="22"/>
+          <w:szCs w:val="22"/>
+          <w:lang w:val="en-US"/>
+        </w:rPr>
+        <w:tab/>
+      </w:r>
+      <w:r>
+        <w:rPr>
+          <w:rFonts w:ascii="Times New Roman" w:hAnsi="Times New Roman" w:cs="Times New Roman"/>
+          <w:spacing w:val="2"/>
+          <w:kern w:val="1"/>
+          <w:sz w:val="22"/>
+          <w:szCs w:val="22"/>
+          <w:lang w:val="en-US"/>
+        </w:rPr>
+        <w:t>XMM-Newton panel member</w:t>
+      </w:r>
+    </w:p>
+    <w:p>
+      <w:pPr>
+        <w:widowControl w:val="0"/>
+        <w:autoSpaceDE w:val="0"/>
+        <w:autoSpaceDN w:val="0"/>
+        <w:adjustRightInd w:val="0"/>
         <w:ind w:left="1440" w:right="78" w:hanging="1440"/>
         <w:rPr>
           <w:rFonts w:ascii="Times New Roman" w:hAnsi="Times New Roman" w:cs="Times New Roman"/>
@@ -2560,23 +3009,6 @@
         </w:rPr>
         <w:t>SUPERVISION OF STUDENTS &amp; TEACHING ACTIVITIES</w:t>
       </w:r>
-    </w:p>
-    <w:p>
-      <w:pPr>
-        <w:widowControl w:val="0"/>
-        <w:autoSpaceDE w:val="0"/>
-        <w:autoSpaceDN w:val="0"/>
-        <w:adjustRightInd w:val="0"/>
-        <w:ind w:right="78"/>
-        <w:rPr>
-          <w:rFonts w:ascii="Times New Roman" w:hAnsi="Times New Roman" w:cs="Times New Roman"/>
-          <w:b/>
-          <w:bCs/>
-          <w:sz w:val="22"/>
-          <w:szCs w:val="22"/>
-          <w:lang w:val="en-US"/>
-        </w:rPr>
-      </w:pPr>
     </w:p>
     <w:p>
       <w:pPr>
@@ -2669,7 +3101,7 @@
           <w:szCs w:val="22"/>
           <w:lang w:val="en-US"/>
         </w:rPr>
-        <w:t xml:space="preserve">Advisor of O. </w:t>
+        <w:t xml:space="preserve">Advisor of O. Kovács (MSc, graduated in 2016; PhD, defended in 2021); B. Seli (MSc, graduated in 2019; PhD, ongoing); of Zs. </w:t>
       </w:r>
       <w:proofErr w:type="spellStart"/>
       <w:r>
@@ -2679,7 +3111,7 @@
           <w:szCs w:val="22"/>
           <w:lang w:val="en-US"/>
         </w:rPr>
-        <w:t>Kovács</w:t>
+        <w:t>Dálya</w:t>
       </w:r>
       <w:proofErr w:type="spellEnd"/>
       <w:r>
@@ -2689,67 +3121,7 @@
           <w:szCs w:val="22"/>
           <w:lang w:val="en-US"/>
         </w:rPr>
-        <w:t xml:space="preserve"> (MSc, graduated in 2016; PhD, defended in 2021); B. </w:t>
-      </w:r>
-      <w:proofErr w:type="spellStart"/>
-      <w:r>
-        <w:rPr>
-          <w:rFonts w:ascii="Times New Roman" w:hAnsi="Times New Roman" w:cs="Times New Roman"/>
-          <w:sz w:val="22"/>
-          <w:szCs w:val="22"/>
-          <w:lang w:val="en-US"/>
-        </w:rPr>
-        <w:t>Seli</w:t>
-      </w:r>
-      <w:proofErr w:type="spellEnd"/>
-      <w:r>
-        <w:rPr>
-          <w:rFonts w:ascii="Times New Roman" w:hAnsi="Times New Roman" w:cs="Times New Roman"/>
-          <w:sz w:val="22"/>
-          <w:szCs w:val="22"/>
-          <w:lang w:val="en-US"/>
-        </w:rPr>
-        <w:t xml:space="preserve"> (MSc, graduated in 2019; PhD, ongoing); of Zs. </w:t>
-      </w:r>
-      <w:proofErr w:type="spellStart"/>
-      <w:r>
-        <w:rPr>
-          <w:rFonts w:ascii="Times New Roman" w:hAnsi="Times New Roman" w:cs="Times New Roman"/>
-          <w:sz w:val="22"/>
-          <w:szCs w:val="22"/>
-          <w:lang w:val="en-US"/>
-        </w:rPr>
-        <w:t>Dálya</w:t>
-      </w:r>
-      <w:proofErr w:type="spellEnd"/>
-      <w:r>
-        <w:rPr>
-          <w:rFonts w:ascii="Times New Roman" w:hAnsi="Times New Roman" w:cs="Times New Roman"/>
-          <w:sz w:val="22"/>
-          <w:szCs w:val="22"/>
-          <w:lang w:val="en-US"/>
-        </w:rPr>
-        <w:t xml:space="preserve"> (MSc, graduated in 2019); Anna </w:t>
-      </w:r>
-      <w:proofErr w:type="spellStart"/>
-      <w:r>
-        <w:rPr>
-          <w:rFonts w:ascii="Times New Roman" w:hAnsi="Times New Roman" w:cs="Times New Roman"/>
-          <w:sz w:val="22"/>
-          <w:szCs w:val="22"/>
-          <w:lang w:val="en-US"/>
-        </w:rPr>
-        <w:t>Görgei</w:t>
-      </w:r>
-      <w:proofErr w:type="spellEnd"/>
-      <w:r>
-        <w:rPr>
-          <w:rFonts w:ascii="Times New Roman" w:hAnsi="Times New Roman" w:cs="Times New Roman"/>
-          <w:sz w:val="22"/>
-          <w:szCs w:val="22"/>
-          <w:lang w:val="en-US"/>
-        </w:rPr>
-        <w:t xml:space="preserve"> (MSc, graduated in 2021; PhD, ongoing)</w:t>
+        <w:t xml:space="preserve"> (MSc, graduated in 2019); Anna Görgei (MSc, graduated in 2021; PhD, ongoing)</w:t>
       </w:r>
     </w:p>
     <w:p>
@@ -2786,56 +3158,16 @@
           <w:szCs w:val="22"/>
           <w:lang w:val="en-US"/>
         </w:rPr>
-        <w:t xml:space="preserve">ars (regular MSc &amp; PhD courses at Eötvös </w:t>
-      </w:r>
-      <w:proofErr w:type="spellStart"/>
-      <w:r>
-        <w:rPr>
-          <w:rFonts w:ascii="Times New Roman" w:hAnsi="Times New Roman" w:cs="Times New Roman"/>
-          <w:sz w:val="22"/>
-          <w:szCs w:val="22"/>
-          <w:lang w:val="en-US"/>
-        </w:rPr>
-        <w:t>Lóránd</w:t>
-      </w:r>
-      <w:proofErr w:type="spellEnd"/>
-      <w:r>
-        <w:rPr>
-          <w:rFonts w:ascii="Times New Roman" w:hAnsi="Times New Roman" w:cs="Times New Roman"/>
-          <w:sz w:val="22"/>
-          <w:szCs w:val="22"/>
-          <w:lang w:val="en-US"/>
-        </w:rPr>
-        <w:t xml:space="preserve"> University);</w:t>
-      </w:r>
-      <w:r>
-        <w:rPr>
-          <w:rFonts w:ascii="Times New Roman" w:hAnsi="Times New Roman" w:cs="Times New Roman"/>
-          <w:sz w:val="22"/>
-          <w:szCs w:val="22"/>
-          <w:lang w:val="en-US"/>
-        </w:rPr>
-        <w:t xml:space="preserve"> Spherical astronomy, Astronomical observations, informatics (Eötvös </w:t>
-      </w:r>
-      <w:proofErr w:type="spellStart"/>
-      <w:r>
-        <w:rPr>
-          <w:rFonts w:ascii="Times New Roman" w:hAnsi="Times New Roman" w:cs="Times New Roman"/>
-          <w:sz w:val="22"/>
-          <w:szCs w:val="22"/>
-          <w:lang w:val="en-US"/>
-        </w:rPr>
-        <w:t>Lóránd</w:t>
-      </w:r>
-      <w:proofErr w:type="spellEnd"/>
-      <w:r>
-        <w:rPr>
-          <w:rFonts w:ascii="Times New Roman" w:hAnsi="Times New Roman" w:cs="Times New Roman"/>
-          <w:sz w:val="22"/>
-          <w:szCs w:val="22"/>
-          <w:lang w:val="en-US"/>
-        </w:rPr>
-        <w:t xml:space="preserve"> University</w:t>
+        <w:t>ars (regular MSc &amp; PhD courses at Eötvös Lóránd University);</w:t>
+      </w:r>
+      <w:r>
+        <w:rPr>
+          <w:rFonts w:ascii="Times New Roman" w:hAnsi="Times New Roman" w:cs="Times New Roman"/>
+          <w:sz w:val="22"/>
+          <w:szCs w:val="22"/>
+          <w:lang w:val="en-US"/>
+        </w:rPr>
+        <w:t xml:space="preserve"> Spherical astronomy, Astronomical observations, informatics (Eötvös Lóránd University</w:t>
       </w:r>
       <w:r>
         <w:rPr>
@@ -2978,6 +3310,480 @@
         <w:autoSpaceDE w:val="0"/>
         <w:autoSpaceDN w:val="0"/>
         <w:adjustRightInd w:val="0"/>
+        <w:ind w:left="1440" w:right="78" w:hanging="1440"/>
+        <w:rPr>
+          <w:rFonts w:ascii="Times New Roman" w:hAnsi="Times New Roman" w:cs="Times New Roman"/>
+          <w:bCs/>
+          <w:sz w:val="22"/>
+          <w:szCs w:val="22"/>
+        </w:rPr>
+      </w:pPr>
+      <w:r>
+        <w:rPr>
+          <w:rFonts w:ascii="Times New Roman" w:hAnsi="Times New Roman" w:cs="Times New Roman"/>
+          <w:bCs/>
+          <w:sz w:val="22"/>
+          <w:szCs w:val="22"/>
+        </w:rPr>
+        <w:t>2025</w:t>
+      </w:r>
+      <w:r>
+        <w:rPr>
+          <w:rFonts w:ascii="Times New Roman" w:hAnsi="Times New Roman" w:cs="Times New Roman"/>
+          <w:bCs/>
+          <w:sz w:val="22"/>
+          <w:szCs w:val="22"/>
+        </w:rPr>
+        <w:tab/>
+        <w:t>EAS 2025 –</w:t>
+      </w:r>
+      <w:r>
+        <w:rPr>
+          <w:rFonts w:ascii="Times New Roman" w:hAnsi="Times New Roman" w:cs="Times New Roman"/>
+          <w:bCs/>
+          <w:sz w:val="22"/>
+          <w:szCs w:val="22"/>
+        </w:rPr>
+        <w:t>Stellar magnetism and its effects on the planetary environment: from solar-like stars to ultracool dwarfs</w:t>
+      </w:r>
+      <w:r>
+        <w:rPr>
+          <w:rFonts w:ascii="Times New Roman" w:hAnsi="Times New Roman" w:cs="Times New Roman"/>
+          <w:bCs/>
+          <w:sz w:val="22"/>
+          <w:szCs w:val="22"/>
+        </w:rPr>
+        <w:t xml:space="preserve"> (</w:t>
+      </w:r>
+      <w:r>
+        <w:rPr>
+          <w:rFonts w:ascii="Times New Roman" w:hAnsi="Times New Roman" w:cs="Times New Roman"/>
+          <w:bCs/>
+          <w:sz w:val="22"/>
+          <w:szCs w:val="22"/>
+        </w:rPr>
+        <w:t xml:space="preserve">Head of SOC in </w:t>
+      </w:r>
+      <w:r>
+        <w:rPr>
+          <w:rFonts w:ascii="Times New Roman" w:hAnsi="Times New Roman" w:cs="Times New Roman"/>
+          <w:bCs/>
+          <w:sz w:val="22"/>
+          <w:szCs w:val="22"/>
+        </w:rPr>
+        <w:t xml:space="preserve">Special session </w:t>
+      </w:r>
+      <w:r>
+        <w:rPr>
+          <w:rFonts w:ascii="Times New Roman" w:hAnsi="Times New Roman" w:cs="Times New Roman"/>
+          <w:bCs/>
+          <w:sz w:val="22"/>
+          <w:szCs w:val="22"/>
+        </w:rPr>
+        <w:t>21</w:t>
+      </w:r>
+      <w:r>
+        <w:rPr>
+          <w:rFonts w:ascii="Times New Roman" w:hAnsi="Times New Roman" w:cs="Times New Roman"/>
+          <w:bCs/>
+          <w:sz w:val="22"/>
+          <w:szCs w:val="22"/>
+        </w:rPr>
+        <w:t>)</w:t>
+      </w:r>
+    </w:p>
+    <w:p>
+      <w:pPr>
+        <w:widowControl w:val="0"/>
+        <w:autoSpaceDE w:val="0"/>
+        <w:autoSpaceDN w:val="0"/>
+        <w:adjustRightInd w:val="0"/>
+        <w:ind w:left="1440" w:right="78" w:hanging="1440"/>
+        <w:rPr>
+          <w:rFonts w:ascii="Times New Roman" w:hAnsi="Times New Roman" w:cs="Times New Roman"/>
+          <w:bCs/>
+          <w:sz w:val="22"/>
+          <w:szCs w:val="22"/>
+        </w:rPr>
+      </w:pPr>
+      <w:r>
+        <w:rPr>
+          <w:rFonts w:ascii="Times New Roman" w:hAnsi="Times New Roman" w:cs="Times New Roman"/>
+          <w:bCs/>
+          <w:sz w:val="22"/>
+          <w:szCs w:val="22"/>
+        </w:rPr>
+        <w:t>2025</w:t>
+      </w:r>
+      <w:r>
+        <w:rPr>
+          <w:rFonts w:ascii="Times New Roman" w:hAnsi="Times New Roman" w:cs="Times New Roman"/>
+          <w:bCs/>
+          <w:sz w:val="22"/>
+          <w:szCs w:val="22"/>
+        </w:rPr>
+        <w:tab/>
+      </w:r>
+      <w:r>
+        <w:rPr>
+          <w:rFonts w:ascii="Times New Roman" w:hAnsi="Times New Roman" w:cs="Times New Roman"/>
+          <w:bCs/>
+          <w:sz w:val="22"/>
+          <w:szCs w:val="22"/>
+        </w:rPr>
+        <w:t>ISSI Workshop: Stellar Magnetism and its Impact on (</w:t>
+      </w:r>
+      <w:proofErr w:type="spellStart"/>
+      <w:r>
+        <w:rPr>
+          <w:rFonts w:ascii="Times New Roman" w:hAnsi="Times New Roman" w:cs="Times New Roman"/>
+          <w:bCs/>
+          <w:sz w:val="22"/>
+          <w:szCs w:val="22"/>
+        </w:rPr>
+        <w:t>exo</w:t>
+      </w:r>
+      <w:proofErr w:type="spellEnd"/>
+      <w:r>
+        <w:rPr>
+          <w:rFonts w:ascii="Times New Roman" w:hAnsi="Times New Roman" w:cs="Times New Roman"/>
+          <w:bCs/>
+          <w:sz w:val="22"/>
+          <w:szCs w:val="22"/>
+        </w:rPr>
+        <w:t xml:space="preserve">)Planets </w:t>
+      </w:r>
+      <w:r>
+        <w:rPr>
+          <w:rFonts w:ascii="Times New Roman" w:hAnsi="Times New Roman" w:cs="Times New Roman"/>
+          <w:bCs/>
+          <w:sz w:val="22"/>
+          <w:szCs w:val="22"/>
+        </w:rPr>
+        <w:t>(SOC member)</w:t>
+      </w:r>
+    </w:p>
+    <w:p>
+      <w:pPr>
+        <w:widowControl w:val="0"/>
+        <w:autoSpaceDE w:val="0"/>
+        <w:autoSpaceDN w:val="0"/>
+        <w:adjustRightInd w:val="0"/>
+        <w:ind w:left="1440" w:right="78" w:hanging="1440"/>
+        <w:rPr>
+          <w:rFonts w:ascii="Times New Roman" w:hAnsi="Times New Roman" w:cs="Times New Roman"/>
+          <w:bCs/>
+          <w:sz w:val="22"/>
+          <w:szCs w:val="22"/>
+        </w:rPr>
+      </w:pPr>
+      <w:r>
+        <w:rPr>
+          <w:rFonts w:ascii="Times New Roman" w:hAnsi="Times New Roman" w:cs="Times New Roman"/>
+          <w:bCs/>
+          <w:sz w:val="22"/>
+          <w:szCs w:val="22"/>
+        </w:rPr>
+        <w:t>2023</w:t>
+      </w:r>
+      <w:r>
+        <w:rPr>
+          <w:rFonts w:ascii="Times New Roman" w:hAnsi="Times New Roman" w:cs="Times New Roman"/>
+          <w:bCs/>
+          <w:sz w:val="22"/>
+          <w:szCs w:val="22"/>
+        </w:rPr>
+        <w:tab/>
+        <w:t>EAS 2023 – </w:t>
+      </w:r>
+      <w:r>
+        <w:rPr>
+          <w:rFonts w:ascii="Times New Roman" w:hAnsi="Times New Roman" w:cs="Times New Roman"/>
+          <w:bCs/>
+          <w:sz w:val="22"/>
+          <w:szCs w:val="22"/>
+        </w:rPr>
+        <w:t>Stars, magnetic activity, and circumstellar environments - confronting simulations and observations</w:t>
+      </w:r>
+      <w:r>
+        <w:rPr>
+          <w:rFonts w:ascii="Times New Roman" w:hAnsi="Times New Roman" w:cs="Times New Roman"/>
+          <w:bCs/>
+          <w:sz w:val="22"/>
+          <w:szCs w:val="22"/>
+        </w:rPr>
+        <w:t xml:space="preserve"> (head of symposium SOC)</w:t>
+      </w:r>
+    </w:p>
+    <w:p>
+      <w:pPr>
+        <w:widowControl w:val="0"/>
+        <w:autoSpaceDE w:val="0"/>
+        <w:autoSpaceDN w:val="0"/>
+        <w:adjustRightInd w:val="0"/>
+        <w:ind w:left="1440" w:right="78" w:hanging="1440"/>
+        <w:rPr>
+          <w:rFonts w:ascii="Times New Roman" w:hAnsi="Times New Roman" w:cs="Times New Roman"/>
+          <w:bCs/>
+          <w:sz w:val="22"/>
+          <w:szCs w:val="22"/>
+        </w:rPr>
+      </w:pPr>
+      <w:r>
+        <w:rPr>
+          <w:rFonts w:ascii="Times New Roman" w:hAnsi="Times New Roman" w:cs="Times New Roman"/>
+          <w:bCs/>
+          <w:sz w:val="22"/>
+          <w:szCs w:val="22"/>
+        </w:rPr>
+        <w:t>2020 (autumn)</w:t>
+      </w:r>
+      <w:r>
+        <w:rPr>
+          <w:rFonts w:ascii="Times New Roman" w:hAnsi="Times New Roman" w:cs="Times New Roman"/>
+          <w:bCs/>
+          <w:sz w:val="22"/>
+          <w:szCs w:val="22"/>
+        </w:rPr>
+        <w:tab/>
+        <w:t>ARIEL consortium meeting, Budapest, Hungary (LOC)</w:t>
+      </w:r>
+    </w:p>
+    <w:p>
+      <w:pPr>
+        <w:widowControl w:val="0"/>
+        <w:autoSpaceDE w:val="0"/>
+        <w:autoSpaceDN w:val="0"/>
+        <w:adjustRightInd w:val="0"/>
+        <w:ind w:left="1440" w:right="78" w:hanging="1440"/>
+        <w:rPr>
+          <w:rFonts w:ascii="Times New Roman" w:hAnsi="Times New Roman" w:cs="Times New Roman"/>
+          <w:bCs/>
+          <w:sz w:val="22"/>
+          <w:szCs w:val="22"/>
+        </w:rPr>
+      </w:pPr>
+      <w:r>
+        <w:rPr>
+          <w:rFonts w:ascii="Times New Roman" w:hAnsi="Times New Roman" w:cs="Times New Roman"/>
+          <w:bCs/>
+          <w:sz w:val="22"/>
+          <w:szCs w:val="22"/>
+        </w:rPr>
+        <w:t>2020 (April)</w:t>
+      </w:r>
+      <w:r>
+        <w:rPr>
+          <w:rFonts w:ascii="Times New Roman" w:hAnsi="Times New Roman" w:cs="Times New Roman"/>
+          <w:bCs/>
+          <w:sz w:val="22"/>
+          <w:szCs w:val="22"/>
+        </w:rPr>
+        <w:tab/>
+      </w:r>
+      <w:r>
+        <w:rPr>
+          <w:rFonts w:ascii="Times New Roman" w:hAnsi="Times New Roman" w:cs="Times New Roman"/>
+          <w:bCs/>
+          <w:sz w:val="22"/>
+          <w:szCs w:val="22"/>
+        </w:rPr>
+        <w:t>Inverse-FIP bias in solar and stellar coronae - lesson learned from the Sun</w:t>
+      </w:r>
+      <w:r>
+        <w:rPr>
+          <w:rFonts w:ascii="Times New Roman" w:hAnsi="Times New Roman" w:cs="Times New Roman"/>
+          <w:bCs/>
+          <w:sz w:val="22"/>
+          <w:szCs w:val="22"/>
+        </w:rPr>
+        <w:t xml:space="preserve">, </w:t>
+      </w:r>
+      <w:r>
+        <w:rPr>
+          <w:rFonts w:ascii="Times New Roman" w:hAnsi="Times New Roman" w:cs="Times New Roman"/>
+          <w:bCs/>
+          <w:sz w:val="22"/>
+          <w:szCs w:val="22"/>
+        </w:rPr>
+        <w:t>Konkoly Observatory, Budapest, Hungary</w:t>
+      </w:r>
+      <w:r>
+        <w:rPr>
+          <w:rFonts w:ascii="Times New Roman" w:hAnsi="Times New Roman" w:cs="Times New Roman"/>
+          <w:bCs/>
+          <w:sz w:val="22"/>
+          <w:szCs w:val="22"/>
+        </w:rPr>
+        <w:t xml:space="preserve"> (LOC)</w:t>
+      </w:r>
+    </w:p>
+    <w:p>
+      <w:pPr>
+        <w:widowControl w:val="0"/>
+        <w:autoSpaceDE w:val="0"/>
+        <w:autoSpaceDN w:val="0"/>
+        <w:adjustRightInd w:val="0"/>
+        <w:ind w:right="78"/>
+        <w:rPr>
+          <w:rFonts w:ascii="Times New Roman" w:hAnsi="Times New Roman" w:cs="Times New Roman"/>
+          <w:bCs/>
+          <w:sz w:val="22"/>
+          <w:szCs w:val="22"/>
+        </w:rPr>
+      </w:pPr>
+      <w:r>
+        <w:rPr>
+          <w:rFonts w:ascii="Times New Roman" w:hAnsi="Times New Roman" w:cs="Times New Roman"/>
+          <w:bCs/>
+          <w:sz w:val="22"/>
+          <w:szCs w:val="22"/>
+        </w:rPr>
+        <w:t>2018</w:t>
+      </w:r>
+      <w:r>
+        <w:rPr>
+          <w:rFonts w:ascii="Times New Roman" w:hAnsi="Times New Roman" w:cs="Times New Roman"/>
+          <w:bCs/>
+          <w:sz w:val="22"/>
+          <w:szCs w:val="22"/>
+        </w:rPr>
+        <w:tab/>
+      </w:r>
+      <w:r>
+        <w:rPr>
+          <w:rFonts w:ascii="Times New Roman" w:hAnsi="Times New Roman" w:cs="Times New Roman"/>
+          <w:bCs/>
+          <w:sz w:val="22"/>
+          <w:szCs w:val="22"/>
+        </w:rPr>
+        <w:tab/>
+      </w:r>
+      <w:r>
+        <w:rPr>
+          <w:rFonts w:ascii="Times New Roman" w:hAnsi="Times New Roman" w:cs="Times New Roman"/>
+          <w:bCs/>
+          <w:sz w:val="22"/>
+          <w:szCs w:val="22"/>
+        </w:rPr>
+        <w:t>Elemental composition in solar and stellar atmospheres &amp; magnetic activity</w:t>
+      </w:r>
+    </w:p>
+    <w:p>
+      <w:pPr>
+        <w:widowControl w:val="0"/>
+        <w:autoSpaceDE w:val="0"/>
+        <w:autoSpaceDN w:val="0"/>
+        <w:adjustRightInd w:val="0"/>
+        <w:ind w:left="720" w:right="78" w:firstLine="720"/>
+        <w:rPr>
+          <w:rFonts w:ascii="Times New Roman" w:hAnsi="Times New Roman" w:cs="Times New Roman"/>
+          <w:bCs/>
+          <w:sz w:val="22"/>
+          <w:szCs w:val="22"/>
+        </w:rPr>
+      </w:pPr>
+      <w:r>
+        <w:rPr>
+          <w:rFonts w:ascii="Times New Roman" w:hAnsi="Times New Roman" w:cs="Times New Roman"/>
+          <w:bCs/>
+          <w:sz w:val="22"/>
+          <w:szCs w:val="22"/>
+        </w:rPr>
+        <w:t>Konkoly Observatory, Budapest, Hungary</w:t>
+      </w:r>
+      <w:r>
+        <w:rPr>
+          <w:rFonts w:ascii="Times New Roman" w:hAnsi="Times New Roman" w:cs="Times New Roman"/>
+          <w:bCs/>
+          <w:sz w:val="22"/>
+          <w:szCs w:val="22"/>
+        </w:rPr>
+        <w:t xml:space="preserve"> (LOC)</w:t>
+      </w:r>
+    </w:p>
+    <w:p>
+      <w:pPr>
+        <w:widowControl w:val="0"/>
+        <w:autoSpaceDE w:val="0"/>
+        <w:autoSpaceDN w:val="0"/>
+        <w:adjustRightInd w:val="0"/>
+        <w:ind w:right="78"/>
+        <w:rPr>
+          <w:rFonts w:ascii="Times New Roman" w:hAnsi="Times New Roman" w:cs="Times New Roman"/>
+          <w:bCs/>
+          <w:sz w:val="22"/>
+          <w:szCs w:val="22"/>
+        </w:rPr>
+      </w:pPr>
+      <w:r>
+        <w:rPr>
+          <w:rFonts w:ascii="Times New Roman" w:hAnsi="Times New Roman" w:cs="Times New Roman"/>
+          <w:bCs/>
+          <w:sz w:val="22"/>
+          <w:szCs w:val="22"/>
+        </w:rPr>
+        <w:t>2017</w:t>
+      </w:r>
+      <w:r>
+        <w:rPr>
+          <w:rFonts w:ascii="Times New Roman" w:hAnsi="Times New Roman" w:cs="Times New Roman"/>
+          <w:bCs/>
+          <w:sz w:val="22"/>
+          <w:szCs w:val="22"/>
+        </w:rPr>
+        <w:tab/>
+      </w:r>
+      <w:r>
+        <w:rPr>
+          <w:rFonts w:ascii="Times New Roman" w:hAnsi="Times New Roman" w:cs="Times New Roman"/>
+          <w:bCs/>
+          <w:sz w:val="22"/>
+          <w:szCs w:val="22"/>
+        </w:rPr>
+        <w:tab/>
+        <w:t xml:space="preserve">FIP/IFIP Workshop, </w:t>
+      </w:r>
+      <w:r>
+        <w:rPr>
+          <w:rFonts w:ascii="Times New Roman" w:hAnsi="Times New Roman" w:cs="Times New Roman"/>
+          <w:bCs/>
+          <w:sz w:val="22"/>
+          <w:szCs w:val="22"/>
+        </w:rPr>
+        <w:t>Konkoly Observatory, Budapest, Hungary</w:t>
+      </w:r>
+      <w:r>
+        <w:rPr>
+          <w:rFonts w:ascii="Times New Roman" w:hAnsi="Times New Roman" w:cs="Times New Roman"/>
+          <w:bCs/>
+          <w:sz w:val="22"/>
+          <w:szCs w:val="22"/>
+        </w:rPr>
+        <w:t xml:space="preserve"> (LOC)</w:t>
+      </w:r>
+    </w:p>
+    <w:p>
+      <w:pPr>
+        <w:widowControl w:val="0"/>
+        <w:autoSpaceDE w:val="0"/>
+        <w:autoSpaceDN w:val="0"/>
+        <w:adjustRightInd w:val="0"/>
+        <w:ind w:right="78"/>
+        <w:rPr>
+          <w:rFonts w:ascii="Times New Roman" w:hAnsi="Times New Roman" w:cs="Times New Roman"/>
+          <w:bCs/>
+          <w:sz w:val="22"/>
+          <w:szCs w:val="22"/>
+        </w:rPr>
+      </w:pPr>
+    </w:p>
+    <w:p>
+      <w:pPr>
+        <w:widowControl w:val="0"/>
+        <w:autoSpaceDE w:val="0"/>
+        <w:autoSpaceDN w:val="0"/>
+        <w:adjustRightInd w:val="0"/>
         <w:ind w:right="78"/>
         <w:rPr>
           <w:rFonts w:ascii="Times New Roman" w:hAnsi="Times New Roman" w:cs="Times New Roman"/>
@@ -2988,305 +3794,50 @@
           <w:lang w:val="en-US"/>
         </w:rPr>
       </w:pPr>
-    </w:p>
-    <w:p>
-      <w:pPr>
-        <w:widowControl w:val="0"/>
-        <w:autoSpaceDE w:val="0"/>
-        <w:autoSpaceDN w:val="0"/>
-        <w:adjustRightInd w:val="0"/>
-        <w:ind w:left="1440" w:right="78" w:hanging="1440"/>
-        <w:rPr>
-          <w:rFonts w:ascii="Times New Roman" w:hAnsi="Times New Roman" w:cs="Times New Roman"/>
-          <w:bCs/>
-          <w:sz w:val="22"/>
-          <w:szCs w:val="22"/>
-        </w:rPr>
-      </w:pPr>
-      <w:r>
-        <w:rPr>
-          <w:rFonts w:ascii="Times New Roman" w:hAnsi="Times New Roman" w:cs="Times New Roman"/>
-          <w:bCs/>
-          <w:sz w:val="22"/>
-          <w:szCs w:val="22"/>
-        </w:rPr>
-        <w:t>2022</w:t>
-      </w:r>
-      <w:r>
-        <w:rPr>
-          <w:rFonts w:ascii="Times New Roman" w:hAnsi="Times New Roman" w:cs="Times New Roman"/>
-          <w:bCs/>
-          <w:sz w:val="22"/>
-          <w:szCs w:val="22"/>
-        </w:rPr>
-        <w:tab/>
-        <w:t>EAS 2023 – </w:t>
-      </w:r>
-      <w:r>
-        <w:rPr>
-          <w:rFonts w:ascii="Times New Roman" w:hAnsi="Times New Roman" w:cs="Times New Roman"/>
-          <w:bCs/>
-          <w:sz w:val="22"/>
-          <w:szCs w:val="22"/>
-        </w:rPr>
-        <w:t>Stars, magnetic activity, and circumstellar environments - confronting simulations and observations</w:t>
-      </w:r>
-      <w:r>
-        <w:rPr>
-          <w:rFonts w:ascii="Times New Roman" w:hAnsi="Times New Roman" w:cs="Times New Roman"/>
-          <w:bCs/>
-          <w:sz w:val="22"/>
-          <w:szCs w:val="22"/>
-        </w:rPr>
-        <w:t xml:space="preserve"> (head of symposium SOC)</w:t>
-      </w:r>
-    </w:p>
-    <w:p>
-      <w:pPr>
-        <w:widowControl w:val="0"/>
-        <w:autoSpaceDE w:val="0"/>
-        <w:autoSpaceDN w:val="0"/>
-        <w:adjustRightInd w:val="0"/>
-        <w:ind w:left="1440" w:right="78" w:hanging="1440"/>
-        <w:rPr>
-          <w:rFonts w:ascii="Times New Roman" w:hAnsi="Times New Roman" w:cs="Times New Roman"/>
-          <w:bCs/>
-          <w:sz w:val="22"/>
-          <w:szCs w:val="22"/>
-        </w:rPr>
-      </w:pPr>
-      <w:r>
-        <w:rPr>
-          <w:rFonts w:ascii="Times New Roman" w:hAnsi="Times New Roman" w:cs="Times New Roman"/>
-          <w:bCs/>
-          <w:sz w:val="22"/>
-          <w:szCs w:val="22"/>
-        </w:rPr>
-        <w:t>2020 (autumn)</w:t>
-      </w:r>
-      <w:r>
-        <w:rPr>
-          <w:rFonts w:ascii="Times New Roman" w:hAnsi="Times New Roman" w:cs="Times New Roman"/>
-          <w:bCs/>
-          <w:sz w:val="22"/>
-          <w:szCs w:val="22"/>
-        </w:rPr>
-        <w:tab/>
-        <w:t>ARIEL consortium meeting, Budapest, Hungary (LOC)</w:t>
-      </w:r>
-    </w:p>
-    <w:p>
-      <w:pPr>
-        <w:widowControl w:val="0"/>
-        <w:autoSpaceDE w:val="0"/>
-        <w:autoSpaceDN w:val="0"/>
-        <w:adjustRightInd w:val="0"/>
-        <w:ind w:left="1440" w:right="78" w:hanging="1440"/>
-        <w:rPr>
-          <w:rFonts w:ascii="Times New Roman" w:hAnsi="Times New Roman" w:cs="Times New Roman"/>
-          <w:bCs/>
-          <w:sz w:val="22"/>
-          <w:szCs w:val="22"/>
-        </w:rPr>
-      </w:pPr>
-      <w:r>
-        <w:rPr>
-          <w:rFonts w:ascii="Times New Roman" w:hAnsi="Times New Roman" w:cs="Times New Roman"/>
-          <w:bCs/>
-          <w:sz w:val="22"/>
-          <w:szCs w:val="22"/>
-        </w:rPr>
-        <w:t>2020 (April)</w:t>
-      </w:r>
-      <w:r>
-        <w:rPr>
-          <w:rFonts w:ascii="Times New Roman" w:hAnsi="Times New Roman" w:cs="Times New Roman"/>
-          <w:bCs/>
-          <w:sz w:val="22"/>
-          <w:szCs w:val="22"/>
-        </w:rPr>
-        <w:tab/>
-      </w:r>
-      <w:r>
-        <w:rPr>
-          <w:rFonts w:ascii="Times New Roman" w:hAnsi="Times New Roman" w:cs="Times New Roman"/>
-          <w:bCs/>
-          <w:sz w:val="22"/>
-          <w:szCs w:val="22"/>
-        </w:rPr>
-        <w:t>Inverse-FIP bias in solar and stellar coronae - lesson learned from the Sun</w:t>
-      </w:r>
-      <w:r>
-        <w:rPr>
-          <w:rFonts w:ascii="Times New Roman" w:hAnsi="Times New Roman" w:cs="Times New Roman"/>
-          <w:bCs/>
-          <w:sz w:val="22"/>
-          <w:szCs w:val="22"/>
-        </w:rPr>
-        <w:t xml:space="preserve">, </w:t>
-      </w:r>
-      <w:r>
-        <w:rPr>
-          <w:rFonts w:ascii="Times New Roman" w:hAnsi="Times New Roman" w:cs="Times New Roman"/>
-          <w:bCs/>
-          <w:sz w:val="22"/>
-          <w:szCs w:val="22"/>
-        </w:rPr>
-        <w:t>Konkoly Observatory, Budapest, Hungary</w:t>
-      </w:r>
-      <w:r>
-        <w:rPr>
-          <w:rFonts w:ascii="Times New Roman" w:hAnsi="Times New Roman" w:cs="Times New Roman"/>
-          <w:bCs/>
-          <w:sz w:val="22"/>
-          <w:szCs w:val="22"/>
-        </w:rPr>
-        <w:t xml:space="preserve"> (LOC)</w:t>
-      </w:r>
-    </w:p>
-    <w:p>
-      <w:pPr>
-        <w:widowControl w:val="0"/>
-        <w:autoSpaceDE w:val="0"/>
-        <w:autoSpaceDN w:val="0"/>
-        <w:adjustRightInd w:val="0"/>
-        <w:ind w:right="78"/>
-        <w:rPr>
-          <w:rFonts w:ascii="Times New Roman" w:hAnsi="Times New Roman" w:cs="Times New Roman"/>
-          <w:bCs/>
-          <w:sz w:val="22"/>
-          <w:szCs w:val="22"/>
-        </w:rPr>
-      </w:pPr>
-      <w:r>
-        <w:rPr>
-          <w:rFonts w:ascii="Times New Roman" w:hAnsi="Times New Roman" w:cs="Times New Roman"/>
-          <w:bCs/>
-          <w:sz w:val="22"/>
-          <w:szCs w:val="22"/>
-        </w:rPr>
-        <w:t>2018</w:t>
-      </w:r>
-      <w:r>
-        <w:rPr>
-          <w:rFonts w:ascii="Times New Roman" w:hAnsi="Times New Roman" w:cs="Times New Roman"/>
-          <w:bCs/>
-          <w:sz w:val="22"/>
-          <w:szCs w:val="22"/>
-        </w:rPr>
-        <w:tab/>
-      </w:r>
-      <w:r>
-        <w:rPr>
-          <w:rFonts w:ascii="Times New Roman" w:hAnsi="Times New Roman" w:cs="Times New Roman"/>
-          <w:bCs/>
-          <w:sz w:val="22"/>
-          <w:szCs w:val="22"/>
-        </w:rPr>
-        <w:tab/>
-      </w:r>
-      <w:r>
-        <w:rPr>
-          <w:rFonts w:ascii="Times New Roman" w:hAnsi="Times New Roman" w:cs="Times New Roman"/>
-          <w:bCs/>
-          <w:sz w:val="22"/>
-          <w:szCs w:val="22"/>
-        </w:rPr>
-        <w:t>Elemental composition in solar and stellar atmospheres &amp; magnetic activity</w:t>
-      </w:r>
-    </w:p>
-    <w:p>
-      <w:pPr>
-        <w:widowControl w:val="0"/>
-        <w:autoSpaceDE w:val="0"/>
-        <w:autoSpaceDN w:val="0"/>
-        <w:adjustRightInd w:val="0"/>
-        <w:ind w:left="720" w:right="78" w:firstLine="720"/>
-        <w:rPr>
-          <w:rFonts w:ascii="Times New Roman" w:hAnsi="Times New Roman" w:cs="Times New Roman"/>
-          <w:bCs/>
-          <w:sz w:val="22"/>
-          <w:szCs w:val="22"/>
-        </w:rPr>
-      </w:pPr>
-      <w:r>
-        <w:rPr>
-          <w:rFonts w:ascii="Times New Roman" w:hAnsi="Times New Roman" w:cs="Times New Roman"/>
-          <w:bCs/>
-          <w:sz w:val="22"/>
-          <w:szCs w:val="22"/>
-        </w:rPr>
-        <w:t>Konkoly Observatory, Budapest, Hungary</w:t>
-      </w:r>
-      <w:r>
-        <w:rPr>
-          <w:rFonts w:ascii="Times New Roman" w:hAnsi="Times New Roman" w:cs="Times New Roman"/>
-          <w:bCs/>
-          <w:sz w:val="22"/>
-          <w:szCs w:val="22"/>
-        </w:rPr>
-        <w:t xml:space="preserve"> (LOC)</w:t>
-      </w:r>
-    </w:p>
-    <w:p>
-      <w:pPr>
-        <w:widowControl w:val="0"/>
-        <w:autoSpaceDE w:val="0"/>
-        <w:autoSpaceDN w:val="0"/>
-        <w:adjustRightInd w:val="0"/>
-        <w:ind w:right="78"/>
-        <w:rPr>
-          <w:rFonts w:ascii="Times New Roman" w:hAnsi="Times New Roman" w:cs="Times New Roman"/>
-          <w:bCs/>
-          <w:sz w:val="22"/>
-          <w:szCs w:val="22"/>
-        </w:rPr>
-      </w:pPr>
-      <w:r>
-        <w:rPr>
-          <w:rFonts w:ascii="Times New Roman" w:hAnsi="Times New Roman" w:cs="Times New Roman"/>
-          <w:bCs/>
-          <w:sz w:val="22"/>
-          <w:szCs w:val="22"/>
-        </w:rPr>
-        <w:t>2017</w:t>
-      </w:r>
-      <w:r>
-        <w:rPr>
-          <w:rFonts w:ascii="Times New Roman" w:hAnsi="Times New Roman" w:cs="Times New Roman"/>
-          <w:bCs/>
-          <w:sz w:val="22"/>
-          <w:szCs w:val="22"/>
-        </w:rPr>
-        <w:tab/>
-      </w:r>
-      <w:r>
-        <w:rPr>
-          <w:rFonts w:ascii="Times New Roman" w:hAnsi="Times New Roman" w:cs="Times New Roman"/>
-          <w:bCs/>
-          <w:sz w:val="22"/>
-          <w:szCs w:val="22"/>
-        </w:rPr>
-        <w:tab/>
-        <w:t xml:space="preserve">FIP/IFIP Workshop, </w:t>
-      </w:r>
-      <w:r>
-        <w:rPr>
-          <w:rFonts w:ascii="Times New Roman" w:hAnsi="Times New Roman" w:cs="Times New Roman"/>
-          <w:bCs/>
-          <w:sz w:val="22"/>
-          <w:szCs w:val="22"/>
-        </w:rPr>
-        <w:t>Konkoly Observatory, Budapest, Hungary</w:t>
-      </w:r>
-      <w:r>
-        <w:rPr>
-          <w:rFonts w:ascii="Times New Roman" w:hAnsi="Times New Roman" w:cs="Times New Roman"/>
-          <w:bCs/>
-          <w:sz w:val="22"/>
-          <w:szCs w:val="22"/>
-        </w:rPr>
-        <w:t xml:space="preserve"> (LOC)</w:t>
+      <w:r>
+        <w:rPr>
+          <w:rFonts w:ascii="Times New Roman" w:hAnsi="Times New Roman" w:cs="Times New Roman"/>
+          <w:bCs/>
+          <w:sz w:val="22"/>
+          <w:szCs w:val="22"/>
+        </w:rPr>
+        <w:t xml:space="preserve">Organizer of the </w:t>
+      </w:r>
+      <w:r>
+        <w:rPr>
+          <w:rFonts w:ascii="Times New Roman" w:hAnsi="Times New Roman" w:cs="Times New Roman"/>
+          <w:bCs/>
+          <w:sz w:val="22"/>
+          <w:szCs w:val="22"/>
+        </w:rPr>
+        <w:t>weekly</w:t>
+      </w:r>
+      <w:r>
+        <w:rPr>
+          <w:rFonts w:ascii="Times New Roman" w:hAnsi="Times New Roman" w:cs="Times New Roman"/>
+          <w:bCs/>
+          <w:sz w:val="22"/>
+          <w:szCs w:val="22"/>
+        </w:rPr>
+        <w:t xml:space="preserve"> seminar </w:t>
+      </w:r>
+      <w:r>
+        <w:rPr>
+          <w:rFonts w:ascii="Times New Roman" w:hAnsi="Times New Roman" w:cs="Times New Roman"/>
+          <w:bCs/>
+          <w:sz w:val="22"/>
+          <w:szCs w:val="22"/>
+        </w:rPr>
+        <w:t xml:space="preserve">series </w:t>
+      </w:r>
+      <w:r>
+        <w:rPr>
+          <w:rFonts w:ascii="Times New Roman" w:hAnsi="Times New Roman" w:cs="Times New Roman"/>
+          <w:bCs/>
+          <w:sz w:val="22"/>
+          <w:szCs w:val="22"/>
+        </w:rPr>
+        <w:t>of Konkoly Observatory since 2018</w:t>
       </w:r>
     </w:p>
     <w:p>
@@ -3314,80 +3865,12 @@
         <w:rPr>
           <w:rFonts w:ascii="Times New Roman" w:hAnsi="Times New Roman" w:cs="Times New Roman"/>
           <w:b/>
-          <w:bCs/>
-          <w:sz w:val="22"/>
-          <w:szCs w:val="22"/>
-          <w:lang w:val="en-US"/>
-        </w:rPr>
-      </w:pPr>
-      <w:r>
-        <w:rPr>
-          <w:rFonts w:ascii="Times New Roman" w:hAnsi="Times New Roman" w:cs="Times New Roman"/>
-          <w:bCs/>
-          <w:sz w:val="22"/>
-          <w:szCs w:val="22"/>
-        </w:rPr>
-        <w:t xml:space="preserve">Organizer of the </w:t>
-      </w:r>
-      <w:r>
-        <w:rPr>
-          <w:rFonts w:ascii="Times New Roman" w:hAnsi="Times New Roman" w:cs="Times New Roman"/>
-          <w:bCs/>
-          <w:sz w:val="22"/>
-          <w:szCs w:val="22"/>
-        </w:rPr>
-        <w:t>weekly</w:t>
-      </w:r>
-      <w:r>
-        <w:rPr>
-          <w:rFonts w:ascii="Times New Roman" w:hAnsi="Times New Roman" w:cs="Times New Roman"/>
-          <w:bCs/>
-          <w:sz w:val="22"/>
-          <w:szCs w:val="22"/>
-        </w:rPr>
-        <w:t xml:space="preserve"> seminar </w:t>
-      </w:r>
-      <w:r>
-        <w:rPr>
-          <w:rFonts w:ascii="Times New Roman" w:hAnsi="Times New Roman" w:cs="Times New Roman"/>
-          <w:bCs/>
-          <w:sz w:val="22"/>
-          <w:szCs w:val="22"/>
-        </w:rPr>
-        <w:t xml:space="preserve">series </w:t>
-      </w:r>
-      <w:r>
-        <w:rPr>
-          <w:rFonts w:ascii="Times New Roman" w:hAnsi="Times New Roman" w:cs="Times New Roman"/>
-          <w:bCs/>
-          <w:sz w:val="22"/>
-          <w:szCs w:val="22"/>
-        </w:rPr>
-        <w:t>of Konkoly Observatory since 2018</w:t>
-      </w:r>
-    </w:p>
-    <w:p>
-      <w:pPr>
-        <w:widowControl w:val="0"/>
-        <w:autoSpaceDE w:val="0"/>
-        <w:autoSpaceDN w:val="0"/>
-        <w:adjustRightInd w:val="0"/>
-        <w:ind w:right="78"/>
-        <w:rPr>
-          <w:rFonts w:ascii="Times New Roman" w:hAnsi="Times New Roman" w:cs="Times New Roman"/>
-          <w:bCs/>
-          <w:sz w:val="22"/>
-          <w:szCs w:val="22"/>
-        </w:rPr>
-      </w:pPr>
-    </w:p>
-    <w:p>
-      <w:pPr>
-        <w:widowControl w:val="0"/>
-        <w:autoSpaceDE w:val="0"/>
-        <w:autoSpaceDN w:val="0"/>
-        <w:adjustRightInd w:val="0"/>
-        <w:ind w:right="78"/>
+          <w:sz w:val="22"/>
+          <w:szCs w:val="22"/>
+          <w:lang w:val="en-US"/>
+        </w:rPr>
+      </w:pPr>
+      <w:r>
         <w:rPr>
           <w:rFonts w:ascii="Times New Roman" w:hAnsi="Times New Roman" w:cs="Times New Roman"/>
           <w:b/>
@@ -3395,7 +3878,8 @@
           <w:szCs w:val="22"/>
           <w:lang w:val="en-US"/>
         </w:rPr>
-      </w:pPr>
+        <w:t xml:space="preserve">MEMBERSHIP </w:t>
+      </w:r>
       <w:r>
         <w:rPr>
           <w:rFonts w:ascii="Times New Roman" w:hAnsi="Times New Roman" w:cs="Times New Roman"/>
@@ -3404,34 +3888,8 @@
           <w:szCs w:val="22"/>
           <w:lang w:val="en-US"/>
         </w:rPr>
-        <w:t xml:space="preserve">MEMBERSHIP </w:t>
-      </w:r>
-      <w:r>
-        <w:rPr>
-          <w:rFonts w:ascii="Times New Roman" w:hAnsi="Times New Roman" w:cs="Times New Roman"/>
-          <w:b/>
-          <w:sz w:val="22"/>
-          <w:szCs w:val="22"/>
-          <w:lang w:val="en-US"/>
-        </w:rPr>
         <w:t>IN SCIENTIFIC SOCIETIES</w:t>
       </w:r>
-    </w:p>
-    <w:p>
-      <w:pPr>
-        <w:widowControl w:val="0"/>
-        <w:autoSpaceDE w:val="0"/>
-        <w:autoSpaceDN w:val="0"/>
-        <w:adjustRightInd w:val="0"/>
-        <w:ind w:right="78"/>
-        <w:rPr>
-          <w:rFonts w:ascii="Times New Roman" w:hAnsi="Times New Roman" w:cs="Times New Roman"/>
-          <w:b/>
-          <w:sz w:val="22"/>
-          <w:szCs w:val="22"/>
-          <w:lang w:val="en-US"/>
-        </w:rPr>
-      </w:pPr>
     </w:p>
     <w:p>
       <w:pPr>
@@ -3605,65 +4063,6 @@
     <w:p>
       <w:pPr>
         <w:widowControl w:val="0"/>
-        <w:autoSpaceDE w:val="0"/>
-        <w:autoSpaceDN w:val="0"/>
-        <w:adjustRightInd w:val="0"/>
-        <w:ind w:left="720" w:right="78"/>
-        <w:rPr>
-          <w:rFonts w:ascii="Times New Roman" w:hAnsi="Times New Roman" w:cs="Times New Roman"/>
-          <w:b/>
-          <w:bCs/>
-          <w:sz w:val="22"/>
-          <w:szCs w:val="22"/>
-          <w:lang w:val="en-US"/>
-        </w:rPr>
-      </w:pPr>
-    </w:p>
-    <w:p>
-      <w:pPr>
-        <w:widowControl w:val="0"/>
-        <w:autoSpaceDE w:val="0"/>
-        <w:autoSpaceDN w:val="0"/>
-        <w:adjustRightInd w:val="0"/>
-        <w:ind w:right="78"/>
-        <w:rPr>
-          <w:rFonts w:ascii="Times New Roman" w:hAnsi="Times New Roman" w:cs="Times New Roman"/>
-          <w:b/>
-          <w:sz w:val="22"/>
-          <w:szCs w:val="22"/>
-          <w:lang w:val="en-US"/>
-        </w:rPr>
-      </w:pPr>
-      <w:r>
-        <w:rPr>
-          <w:rFonts w:ascii="Times New Roman" w:hAnsi="Times New Roman" w:cs="Times New Roman"/>
-          <w:b/>
-          <w:sz w:val="22"/>
-          <w:szCs w:val="22"/>
-          <w:lang w:val="en-US"/>
-        </w:rPr>
-        <w:t xml:space="preserve">PUBLIC OUTREACH </w:t>
-      </w:r>
-    </w:p>
-    <w:p>
-      <w:pPr>
-        <w:widowControl w:val="0"/>
-        <w:autoSpaceDE w:val="0"/>
-        <w:autoSpaceDN w:val="0"/>
-        <w:adjustRightInd w:val="0"/>
-        <w:ind w:right="78"/>
-        <w:rPr>
-          <w:rFonts w:ascii="Times New Roman" w:hAnsi="Times New Roman" w:cs="Times New Roman"/>
-          <w:b/>
-          <w:sz w:val="22"/>
-          <w:szCs w:val="22"/>
-          <w:lang w:val="en-US"/>
-        </w:rPr>
-      </w:pPr>
-    </w:p>
-    <w:p>
-      <w:pPr>
-        <w:widowControl w:val="0"/>
         <w:numPr>
           <w:ilvl w:val="0"/>
           <w:numId w:val="2"/>
@@ -3674,6 +4073,39 @@
         <w:ind w:right="78"/>
         <w:rPr>
           <w:rFonts w:ascii="Times New Roman" w:hAnsi="Times New Roman" w:cs="Times New Roman"/>
+          <w:sz w:val="22"/>
+          <w:szCs w:val="22"/>
+          <w:lang w:val="en-US"/>
+        </w:rPr>
+      </w:pPr>
+      <w:r>
+        <w:rPr>
+          <w:rFonts w:ascii="Times New Roman" w:hAnsi="Times New Roman" w:cs="Times New Roman"/>
+          <w:sz w:val="22"/>
+          <w:szCs w:val="22"/>
+          <w:lang w:val="en-US"/>
+        </w:rPr>
+        <w:t>Secretary of the Astronomy and Space Physics Committee of the Hungarian Academy of Sciences</w:t>
+      </w:r>
+      <w:r>
+        <w:rPr>
+          <w:rFonts w:ascii="Times New Roman" w:hAnsi="Times New Roman" w:cs="Times New Roman"/>
+          <w:sz w:val="22"/>
+          <w:szCs w:val="22"/>
+          <w:lang w:val="en-US"/>
+        </w:rPr>
+        <w:t xml:space="preserve"> (2024–)</w:t>
+      </w:r>
+    </w:p>
+    <w:p>
+      <w:pPr>
+        <w:widowControl w:val="0"/>
+        <w:autoSpaceDE w:val="0"/>
+        <w:autoSpaceDN w:val="0"/>
+        <w:adjustRightInd w:val="0"/>
+        <w:ind w:left="720" w:right="78"/>
+        <w:rPr>
+          <w:rFonts w:ascii="Times New Roman" w:hAnsi="Times New Roman" w:cs="Times New Roman"/>
           <w:b/>
           <w:bCs/>
           <w:sz w:val="22"/>
@@ -3681,14 +4113,31 @@
           <w:lang w:val="en-US"/>
         </w:rPr>
       </w:pPr>
-      <w:r>
-        <w:rPr>
-          <w:rFonts w:ascii="Times New Roman" w:hAnsi="Times New Roman" w:cs="Times New Roman"/>
-          <w:sz w:val="22"/>
-          <w:szCs w:val="22"/>
-          <w:lang w:val="en-US"/>
-        </w:rPr>
-        <w:t>Several contributions at the of the Hungarian astronomy news site csillagaszat.hu</w:t>
+    </w:p>
+    <w:p>
+      <w:pPr>
+        <w:widowControl w:val="0"/>
+        <w:autoSpaceDE w:val="0"/>
+        <w:autoSpaceDN w:val="0"/>
+        <w:adjustRightInd w:val="0"/>
+        <w:ind w:right="78"/>
+        <w:rPr>
+          <w:rFonts w:ascii="Times New Roman" w:hAnsi="Times New Roman" w:cs="Times New Roman"/>
+          <w:b/>
+          <w:sz w:val="22"/>
+          <w:szCs w:val="22"/>
+          <w:lang w:val="en-US"/>
+        </w:rPr>
+      </w:pPr>
+      <w:r>
+        <w:rPr>
+          <w:rFonts w:ascii="Times New Roman" w:hAnsi="Times New Roman" w:cs="Times New Roman"/>
+          <w:b/>
+          <w:sz w:val="22"/>
+          <w:szCs w:val="22"/>
+          <w:lang w:val="en-US"/>
+        </w:rPr>
+        <w:t xml:space="preserve">PUBLIC OUTREACH </w:t>
       </w:r>
     </w:p>
     <w:p>
@@ -3718,86 +4167,8 @@
           <w:szCs w:val="22"/>
           <w:lang w:val="en-US"/>
         </w:rPr>
-        <w:t xml:space="preserve">Several public lectures (Budapest Science Meetup, </w:t>
-      </w:r>
-      <w:proofErr w:type="spellStart"/>
-      <w:r>
-        <w:rPr>
-          <w:rFonts w:ascii="Times New Roman" w:hAnsi="Times New Roman" w:cs="Times New Roman"/>
-          <w:sz w:val="22"/>
-          <w:szCs w:val="22"/>
-          <w:lang w:val="en-US"/>
-        </w:rPr>
-        <w:t>Szertár</w:t>
-      </w:r>
-      <w:proofErr w:type="spellEnd"/>
-      <w:r>
-        <w:rPr>
-          <w:rFonts w:ascii="Times New Roman" w:hAnsi="Times New Roman" w:cs="Times New Roman"/>
-          <w:sz w:val="22"/>
-          <w:szCs w:val="22"/>
-          <w:lang w:val="en-US"/>
-        </w:rPr>
-        <w:t xml:space="preserve"> podcast, schools, etc.), several interviews in TV, radio, and newspapers</w:t>
-      </w:r>
-    </w:p>
-    <w:p>
-      <w:pPr>
-        <w:widowControl w:val="0"/>
-        <w:autoSpaceDE w:val="0"/>
-        <w:autoSpaceDN w:val="0"/>
-        <w:adjustRightInd w:val="0"/>
-        <w:ind w:left="720" w:right="78"/>
-        <w:jc w:val="both"/>
-        <w:rPr>
-          <w:rFonts w:ascii="Times New Roman" w:hAnsi="Times New Roman" w:cs="Times New Roman"/>
-          <w:sz w:val="22"/>
-          <w:szCs w:val="22"/>
-          <w:lang w:val="en-US"/>
-        </w:rPr>
-      </w:pPr>
-    </w:p>
-    <w:p>
-      <w:pPr>
-        <w:widowControl w:val="0"/>
-        <w:autoSpaceDE w:val="0"/>
-        <w:autoSpaceDN w:val="0"/>
-        <w:adjustRightInd w:val="0"/>
-        <w:ind w:right="78"/>
-        <w:rPr>
-          <w:rFonts w:ascii="Times New Roman" w:hAnsi="Times New Roman" w:cs="Times New Roman"/>
-          <w:b/>
-          <w:sz w:val="22"/>
-          <w:szCs w:val="22"/>
-          <w:lang w:val="en-US"/>
-        </w:rPr>
-      </w:pPr>
-      <w:r>
-        <w:rPr>
-          <w:rFonts w:ascii="Times New Roman" w:hAnsi="Times New Roman" w:cs="Times New Roman"/>
-          <w:b/>
-          <w:sz w:val="22"/>
-          <w:szCs w:val="22"/>
-          <w:lang w:val="en-US"/>
-        </w:rPr>
-        <w:t>MAJOR COLLABORATIONS</w:t>
-      </w:r>
-    </w:p>
-    <w:p>
-      <w:pPr>
-        <w:widowControl w:val="0"/>
-        <w:autoSpaceDE w:val="0"/>
-        <w:autoSpaceDN w:val="0"/>
-        <w:adjustRightInd w:val="0"/>
-        <w:ind w:right="78"/>
-        <w:rPr>
-          <w:rFonts w:ascii="Times New Roman" w:hAnsi="Times New Roman" w:cs="Times New Roman"/>
-          <w:b/>
-          <w:sz w:val="22"/>
-          <w:szCs w:val="22"/>
-          <w:lang w:val="en-US"/>
-        </w:rPr>
-      </w:pPr>
+        <w:t>Several contributions at the of the Hungarian astronomy news site csillagaszat.hu</w:t>
+      </w:r>
     </w:p>
     <w:p>
       <w:pPr>
@@ -3822,108 +4193,109 @@
       <w:r>
         <w:rPr>
           <w:rFonts w:ascii="Times New Roman" w:hAnsi="Times New Roman" w:cs="Times New Roman"/>
-          <w:bCs/>
-          <w:sz w:val="22"/>
-          <w:szCs w:val="22"/>
-        </w:rPr>
-        <w:t xml:space="preserve">University of Graz, Austria (Martin </w:t>
+          <w:sz w:val="22"/>
+          <w:szCs w:val="22"/>
+          <w:lang w:val="en-US"/>
+        </w:rPr>
+        <w:t xml:space="preserve">Several public lectures (Budapest Science Meetup, </w:t>
       </w:r>
       <w:proofErr w:type="spellStart"/>
       <w:r>
         <w:rPr>
           <w:rFonts w:ascii="Times New Roman" w:hAnsi="Times New Roman" w:cs="Times New Roman"/>
-          <w:bCs/>
-          <w:sz w:val="22"/>
-          <w:szCs w:val="22"/>
-        </w:rPr>
-        <w:t>Leitzinger</w:t>
+          <w:sz w:val="22"/>
+          <w:szCs w:val="22"/>
+          <w:lang w:val="en-US"/>
+        </w:rPr>
+        <w:t>Szertár</w:t>
       </w:r>
       <w:proofErr w:type="spellEnd"/>
       <w:r>
         <w:rPr>
           <w:rFonts w:ascii="Times New Roman" w:hAnsi="Times New Roman" w:cs="Times New Roman"/>
-          <w:bCs/>
-          <w:sz w:val="22"/>
-          <w:szCs w:val="22"/>
-        </w:rPr>
-        <w:t xml:space="preserve">, Petra </w:t>
-      </w:r>
-      <w:proofErr w:type="spellStart"/>
-      <w:r>
-        <w:rPr>
-          <w:rFonts w:ascii="Times New Roman" w:hAnsi="Times New Roman" w:cs="Times New Roman"/>
-          <w:bCs/>
-          <w:sz w:val="22"/>
-          <w:szCs w:val="22"/>
-        </w:rPr>
-        <w:t>Odert</w:t>
-      </w:r>
-      <w:proofErr w:type="spellEnd"/>
-      <w:r>
-        <w:rPr>
-          <w:rFonts w:ascii="Times New Roman" w:hAnsi="Times New Roman" w:cs="Times New Roman"/>
-          <w:bCs/>
-          <w:sz w:val="22"/>
-          <w:szCs w:val="22"/>
-        </w:rPr>
-        <w:t xml:space="preserve">, Robert </w:t>
-      </w:r>
-      <w:proofErr w:type="spellStart"/>
-      <w:r>
-        <w:rPr>
-          <w:rFonts w:ascii="Times New Roman" w:hAnsi="Times New Roman" w:cs="Times New Roman"/>
-          <w:bCs/>
-          <w:sz w:val="22"/>
-          <w:szCs w:val="22"/>
-        </w:rPr>
-        <w:t>Greimel</w:t>
-      </w:r>
-      <w:proofErr w:type="spellEnd"/>
-      <w:r>
-        <w:rPr>
-          <w:rFonts w:ascii="Times New Roman" w:hAnsi="Times New Roman" w:cs="Times New Roman"/>
-          <w:bCs/>
-          <w:sz w:val="22"/>
-          <w:szCs w:val="22"/>
-        </w:rPr>
-        <w:t xml:space="preserve"> – coronal mass ejection of stars</w:t>
-      </w:r>
-      <w:r>
-        <w:rPr>
-          <w:rFonts w:ascii="Times New Roman" w:hAnsi="Times New Roman" w:cs="Times New Roman"/>
-          <w:bCs/>
-          <w:sz w:val="22"/>
-          <w:szCs w:val="22"/>
-        </w:rPr>
-        <w:t xml:space="preserve">, regular bilateral visits with joint </w:t>
-      </w:r>
-      <w:r>
-        <w:rPr>
-          <w:rFonts w:ascii="Times New Roman" w:hAnsi="Times New Roman" w:cs="Times New Roman"/>
-          <w:sz w:val="22"/>
-          <w:szCs w:val="22"/>
-          <w:lang w:val="en-US"/>
-        </w:rPr>
-        <w:t>“Austrian–Hungarian Action Foundation” grant</w:t>
-      </w:r>
-      <w:r>
-        <w:rPr>
-          <w:rFonts w:ascii="Times New Roman" w:hAnsi="Times New Roman" w:cs="Times New Roman"/>
-          <w:sz w:val="22"/>
-          <w:szCs w:val="22"/>
-          <w:lang w:val="en-US"/>
-        </w:rPr>
-        <w:t>s, regular joint telescope time applications</w:t>
-      </w:r>
-      <w:r>
-        <w:rPr>
-          <w:rFonts w:ascii="Times New Roman" w:hAnsi="Times New Roman" w:cs="Times New Roman"/>
-          <w:bCs/>
-          <w:sz w:val="22"/>
-          <w:szCs w:val="22"/>
-        </w:rPr>
-        <w:t>)</w:t>
-      </w:r>
+          <w:sz w:val="22"/>
+          <w:szCs w:val="22"/>
+          <w:lang w:val="en-US"/>
+        </w:rPr>
+        <w:t xml:space="preserve"> podcast, schools, etc.), several interviews in TV, radio, and newspapers</w:t>
+      </w:r>
+    </w:p>
+    <w:p>
+      <w:pPr>
+        <w:rPr>
+          <w:rFonts w:ascii="Times New Roman" w:hAnsi="Times New Roman" w:cs="Times New Roman"/>
+          <w:sz w:val="22"/>
+          <w:szCs w:val="22"/>
+          <w:lang w:val="en-US"/>
+        </w:rPr>
+      </w:pPr>
+      <w:r>
+        <w:rPr>
+          <w:rFonts w:ascii="Times New Roman" w:hAnsi="Times New Roman" w:cs="Times New Roman"/>
+          <w:sz w:val="22"/>
+          <w:szCs w:val="22"/>
+          <w:lang w:val="en-US"/>
+        </w:rPr>
+        <w:br w:type="page"/>
+      </w:r>
+    </w:p>
+    <w:p>
+      <w:pPr>
+        <w:widowControl w:val="0"/>
+        <w:autoSpaceDE w:val="0"/>
+        <w:autoSpaceDN w:val="0"/>
+        <w:adjustRightInd w:val="0"/>
+        <w:ind w:left="720" w:right="78"/>
+        <w:jc w:val="both"/>
+        <w:rPr>
+          <w:rFonts w:ascii="Times New Roman" w:hAnsi="Times New Roman" w:cs="Times New Roman"/>
+          <w:sz w:val="22"/>
+          <w:szCs w:val="22"/>
+          <w:lang w:val="en-US"/>
+        </w:rPr>
+      </w:pPr>
+    </w:p>
+    <w:p>
+      <w:pPr>
+        <w:widowControl w:val="0"/>
+        <w:autoSpaceDE w:val="0"/>
+        <w:autoSpaceDN w:val="0"/>
+        <w:adjustRightInd w:val="0"/>
+        <w:ind w:right="78"/>
+        <w:rPr>
+          <w:rFonts w:ascii="Times New Roman" w:hAnsi="Times New Roman" w:cs="Times New Roman"/>
+          <w:b/>
+          <w:sz w:val="22"/>
+          <w:szCs w:val="22"/>
+          <w:lang w:val="en-US"/>
+        </w:rPr>
+      </w:pPr>
+      <w:r>
+        <w:rPr>
+          <w:rFonts w:ascii="Times New Roman" w:hAnsi="Times New Roman" w:cs="Times New Roman"/>
+          <w:b/>
+          <w:sz w:val="22"/>
+          <w:szCs w:val="22"/>
+          <w:lang w:val="en-US"/>
+        </w:rPr>
+        <w:t>MAJOR COLLABORATIONS</w:t>
+      </w:r>
+    </w:p>
+    <w:p>
+      <w:pPr>
+        <w:widowControl w:val="0"/>
+        <w:autoSpaceDE w:val="0"/>
+        <w:autoSpaceDN w:val="0"/>
+        <w:adjustRightInd w:val="0"/>
+        <w:ind w:right="78"/>
+        <w:rPr>
+          <w:rFonts w:ascii="Times New Roman" w:hAnsi="Times New Roman" w:cs="Times New Roman"/>
+          <w:b/>
+          <w:sz w:val="22"/>
+          <w:szCs w:val="22"/>
+          <w:lang w:val="en-US"/>
+        </w:rPr>
+      </w:pPr>
     </w:p>
     <w:p>
       <w:pPr>
@@ -3939,44 +4311,94 @@
         <w:rPr>
           <w:rFonts w:ascii="Times New Roman" w:hAnsi="Times New Roman" w:cs="Times New Roman"/>
           <w:b/>
-          <w:sz w:val="22"/>
-          <w:szCs w:val="22"/>
-          <w:lang w:val="en-US"/>
-        </w:rPr>
-      </w:pPr>
-      <w:r>
-        <w:rPr>
-          <w:rFonts w:ascii="Times New Roman" w:hAnsi="Times New Roman" w:cs="Times New Roman"/>
-          <w:sz w:val="22"/>
-          <w:szCs w:val="22"/>
-          <w:lang w:val="en-US"/>
-        </w:rPr>
-        <w:t>University of Michigan</w:t>
-      </w:r>
-      <w:r>
-        <w:rPr>
-          <w:rFonts w:ascii="Times New Roman" w:hAnsi="Times New Roman" w:cs="Times New Roman"/>
-          <w:sz w:val="22"/>
-          <w:szCs w:val="22"/>
-          <w:lang w:val="en-US"/>
-        </w:rPr>
-        <w:t>, USA (Rachael Roettenbacher – flares, analysis of space photometry</w:t>
-      </w:r>
-      <w:r>
-        <w:rPr>
-          <w:rFonts w:ascii="Times New Roman" w:hAnsi="Times New Roman" w:cs="Times New Roman"/>
-          <w:sz w:val="22"/>
-          <w:szCs w:val="22"/>
-          <w:lang w:val="en-US"/>
-        </w:rPr>
-        <w:t>, visiting our research group regularly, joint grant applications</w:t>
-      </w:r>
-      <w:r>
-        <w:rPr>
-          <w:rFonts w:ascii="Times New Roman" w:hAnsi="Times New Roman" w:cs="Times New Roman"/>
-          <w:sz w:val="22"/>
-          <w:szCs w:val="22"/>
-          <w:lang w:val="en-US"/>
+          <w:bCs/>
+          <w:sz w:val="22"/>
+          <w:szCs w:val="22"/>
+          <w:lang w:val="en-US"/>
+        </w:rPr>
+      </w:pPr>
+      <w:r>
+        <w:rPr>
+          <w:rFonts w:ascii="Times New Roman" w:hAnsi="Times New Roman" w:cs="Times New Roman"/>
+          <w:bCs/>
+          <w:sz w:val="22"/>
+          <w:szCs w:val="22"/>
+        </w:rPr>
+        <w:t xml:space="preserve">University of Graz, Austria (Martin Leitzinger, Petra </w:t>
+      </w:r>
+      <w:proofErr w:type="spellStart"/>
+      <w:r>
+        <w:rPr>
+          <w:rFonts w:ascii="Times New Roman" w:hAnsi="Times New Roman" w:cs="Times New Roman"/>
+          <w:bCs/>
+          <w:sz w:val="22"/>
+          <w:szCs w:val="22"/>
+        </w:rPr>
+        <w:t>Odert</w:t>
+      </w:r>
+      <w:proofErr w:type="spellEnd"/>
+      <w:r>
+        <w:rPr>
+          <w:rFonts w:ascii="Times New Roman" w:hAnsi="Times New Roman" w:cs="Times New Roman"/>
+          <w:bCs/>
+          <w:sz w:val="22"/>
+          <w:szCs w:val="22"/>
+        </w:rPr>
+        <w:t xml:space="preserve">, Robert </w:t>
+      </w:r>
+      <w:proofErr w:type="spellStart"/>
+      <w:r>
+        <w:rPr>
+          <w:rFonts w:ascii="Times New Roman" w:hAnsi="Times New Roman" w:cs="Times New Roman"/>
+          <w:bCs/>
+          <w:sz w:val="22"/>
+          <w:szCs w:val="22"/>
+        </w:rPr>
+        <w:t>Greimel</w:t>
+      </w:r>
+      <w:proofErr w:type="spellEnd"/>
+      <w:r>
+        <w:rPr>
+          <w:rFonts w:ascii="Times New Roman" w:hAnsi="Times New Roman" w:cs="Times New Roman"/>
+          <w:bCs/>
+          <w:sz w:val="22"/>
+          <w:szCs w:val="22"/>
+        </w:rPr>
+        <w:t xml:space="preserve"> – coronal mass ejection of stars</w:t>
+      </w:r>
+      <w:r>
+        <w:rPr>
+          <w:rFonts w:ascii="Times New Roman" w:hAnsi="Times New Roman" w:cs="Times New Roman"/>
+          <w:bCs/>
+          <w:sz w:val="22"/>
+          <w:szCs w:val="22"/>
+        </w:rPr>
+        <w:t xml:space="preserve">, regular bilateral visits with joint </w:t>
+      </w:r>
+      <w:r>
+        <w:rPr>
+          <w:rFonts w:ascii="Times New Roman" w:hAnsi="Times New Roman" w:cs="Times New Roman"/>
+          <w:sz w:val="22"/>
+          <w:szCs w:val="22"/>
+          <w:lang w:val="en-US"/>
+        </w:rPr>
+        <w:t>“Austrian–Hungarian Action Foundation” grant</w:t>
+      </w:r>
+      <w:r>
+        <w:rPr>
+          <w:rFonts w:ascii="Times New Roman" w:hAnsi="Times New Roman" w:cs="Times New Roman"/>
+          <w:sz w:val="22"/>
+          <w:szCs w:val="22"/>
+          <w:lang w:val="en-US"/>
+        </w:rPr>
+        <w:t>s, regular joint telescope time applications</w:t>
+      </w:r>
+      <w:r>
+        <w:rPr>
+          <w:rFonts w:ascii="Times New Roman" w:hAnsi="Times New Roman" w:cs="Times New Roman"/>
+          <w:bCs/>
+          <w:sz w:val="22"/>
+          <w:szCs w:val="22"/>
         </w:rPr>
         <w:t>)</w:t>
       </w:r>
@@ -3994,28 +4416,47 @@
         <w:ind w:right="78"/>
         <w:rPr>
           <w:rFonts w:ascii="Times New Roman" w:hAnsi="Times New Roman" w:cs="Times New Roman"/>
-          <w:sz w:val="22"/>
-          <w:szCs w:val="22"/>
-          <w:lang w:val="en-US"/>
-        </w:rPr>
-      </w:pPr>
-      <w:r>
-        <w:rPr>
-          <w:rFonts w:ascii="Times New Roman" w:hAnsi="Times New Roman" w:cs="Times New Roman"/>
-          <w:sz w:val="22"/>
-          <w:szCs w:val="22"/>
-          <w:lang w:val="en-US"/>
-        </w:rPr>
-        <w:t>MPIA, Germany</w:t>
-      </w:r>
-      <w:r>
-        <w:rPr>
-          <w:rFonts w:ascii="Times New Roman" w:hAnsi="Times New Roman" w:cs="Times New Roman"/>
-          <w:sz w:val="22"/>
-          <w:szCs w:val="22"/>
-          <w:lang w:val="en-US"/>
-        </w:rPr>
-        <w:t xml:space="preserve"> (Heidi Korhonen – various aspects of stellar activity, host of the two Eötvös grants)</w:t>
+          <w:b/>
+          <w:sz w:val="22"/>
+          <w:szCs w:val="22"/>
+          <w:lang w:val="en-US"/>
+        </w:rPr>
+      </w:pPr>
+      <w:r>
+        <w:rPr>
+          <w:rFonts w:ascii="Times New Roman" w:hAnsi="Times New Roman" w:cs="Times New Roman"/>
+          <w:sz w:val="22"/>
+          <w:szCs w:val="22"/>
+          <w:lang w:val="en-US"/>
+        </w:rPr>
+        <w:t>University of Michigan</w:t>
+      </w:r>
+      <w:r>
+        <w:rPr>
+          <w:rFonts w:ascii="Times New Roman" w:hAnsi="Times New Roman" w:cs="Times New Roman"/>
+          <w:sz w:val="22"/>
+          <w:szCs w:val="22"/>
+          <w:lang w:val="en-US"/>
+        </w:rPr>
+        <w:t>, USA (Rachael Roettenbacher – flares, analysis of space photometry</w:t>
+      </w:r>
+      <w:r>
+        <w:rPr>
+          <w:rFonts w:ascii="Times New Roman" w:hAnsi="Times New Roman" w:cs="Times New Roman"/>
+          <w:sz w:val="22"/>
+          <w:szCs w:val="22"/>
+          <w:lang w:val="en-US"/>
+        </w:rPr>
+        <w:t>, visiting our research group regularly, joint grant applications</w:t>
+      </w:r>
+      <w:r>
+        <w:rPr>
+          <w:rFonts w:ascii="Times New Roman" w:hAnsi="Times New Roman" w:cs="Times New Roman"/>
+          <w:sz w:val="22"/>
+          <w:szCs w:val="22"/>
+          <w:lang w:val="en-US"/>
+        </w:rPr>
+        <w:t>)</w:t>
       </w:r>
     </w:p>
     <w:p>
@@ -4043,6 +4484,43 @@
           <w:szCs w:val="22"/>
           <w:lang w:val="en-US"/>
         </w:rPr>
+        <w:t>MPIA, Germany</w:t>
+      </w:r>
+      <w:r>
+        <w:rPr>
+          <w:rFonts w:ascii="Times New Roman" w:hAnsi="Times New Roman" w:cs="Times New Roman"/>
+          <w:sz w:val="22"/>
+          <w:szCs w:val="22"/>
+          <w:lang w:val="en-US"/>
+        </w:rPr>
+        <w:t xml:space="preserve"> (Heidi Korhonen – various aspects of stellar activity, host of the two Eötvös grants)</w:t>
+      </w:r>
+    </w:p>
+    <w:p>
+      <w:pPr>
+        <w:widowControl w:val="0"/>
+        <w:numPr>
+          <w:ilvl w:val="0"/>
+          <w:numId w:val="2"/>
+        </w:numPr>
+        <w:autoSpaceDE w:val="0"/>
+        <w:autoSpaceDN w:val="0"/>
+        <w:adjustRightInd w:val="0"/>
+        <w:ind w:right="78"/>
+        <w:rPr>
+          <w:rFonts w:ascii="Times New Roman" w:hAnsi="Times New Roman" w:cs="Times New Roman"/>
+          <w:sz w:val="22"/>
+          <w:szCs w:val="22"/>
+          <w:lang w:val="en-US"/>
+        </w:rPr>
+      </w:pPr>
+      <w:r>
+        <w:rPr>
+          <w:rFonts w:ascii="Times New Roman" w:hAnsi="Times New Roman" w:cs="Times New Roman"/>
+          <w:sz w:val="22"/>
+          <w:szCs w:val="22"/>
+          <w:lang w:val="en-US"/>
+        </w:rPr>
         <w:t>Harvard/</w:t>
       </w:r>
       <w:proofErr w:type="spellStart"/>
@@ -4063,47 +4541,7 @@
           <w:szCs w:val="22"/>
           <w:lang w:val="en-US"/>
         </w:rPr>
-        <w:t>, USA (</w:t>
-      </w:r>
-      <w:proofErr w:type="spellStart"/>
-      <w:r>
-        <w:rPr>
-          <w:rFonts w:ascii="Times New Roman" w:hAnsi="Times New Roman" w:cs="Times New Roman"/>
-          <w:sz w:val="22"/>
-          <w:szCs w:val="22"/>
-          <w:lang w:val="en-US"/>
-        </w:rPr>
-        <w:t>Ákos</w:t>
-      </w:r>
-      <w:proofErr w:type="spellEnd"/>
-      <w:r>
-        <w:rPr>
-          <w:rFonts w:ascii="Times New Roman" w:hAnsi="Times New Roman" w:cs="Times New Roman"/>
-          <w:sz w:val="22"/>
-          <w:szCs w:val="22"/>
-          <w:lang w:val="en-US"/>
-        </w:rPr>
-        <w:t xml:space="preserve"> </w:t>
-      </w:r>
-      <w:proofErr w:type="spellStart"/>
-      <w:r>
-        <w:rPr>
-          <w:rFonts w:ascii="Times New Roman" w:hAnsi="Times New Roman" w:cs="Times New Roman"/>
-          <w:sz w:val="22"/>
-          <w:szCs w:val="22"/>
-          <w:lang w:val="en-US"/>
-        </w:rPr>
-        <w:t>Bogdán</w:t>
-      </w:r>
-      <w:proofErr w:type="spellEnd"/>
-      <w:r>
-        <w:rPr>
-          <w:rFonts w:ascii="Times New Roman" w:hAnsi="Times New Roman" w:cs="Times New Roman"/>
-          <w:sz w:val="22"/>
-          <w:szCs w:val="22"/>
-          <w:lang w:val="en-US"/>
-        </w:rPr>
-        <w:t xml:space="preserve"> – X-ray activity of late-type dwarfs, host in </w:t>
+        <w:t xml:space="preserve">, USA (Ákos Bogdán – X-ray activity of late-type dwarfs, host in </w:t>
       </w:r>
       <w:r>
         <w:rPr>
@@ -4122,27 +4560,7 @@
           <w:szCs w:val="22"/>
           <w:lang w:val="en-US"/>
         </w:rPr>
-        <w:t xml:space="preserve">joint PhD advisor of O. </w:t>
-      </w:r>
-      <w:proofErr w:type="spellStart"/>
-      <w:r>
-        <w:rPr>
-          <w:rFonts w:ascii="Times New Roman" w:hAnsi="Times New Roman" w:cs="Times New Roman"/>
-          <w:sz w:val="22"/>
-          <w:szCs w:val="22"/>
-          <w:lang w:val="en-US"/>
-        </w:rPr>
-        <w:t>Kovács</w:t>
-      </w:r>
-      <w:proofErr w:type="spellEnd"/>
-      <w:r>
-        <w:rPr>
-          <w:rFonts w:ascii="Times New Roman" w:hAnsi="Times New Roman" w:cs="Times New Roman"/>
-          <w:sz w:val="22"/>
-          <w:szCs w:val="22"/>
-          <w:lang w:val="en-US"/>
-        </w:rPr>
-        <w:t xml:space="preserve">) </w:t>
+        <w:t xml:space="preserve">joint PhD advisor of O. Kovács) </w:t>
       </w:r>
     </w:p>
     <w:sectPr>
@@ -4156,7 +4574,7 @@
 </file>
 
 <file path=word/numbering.xml><?xml version="1.0" encoding="utf-8"?>
-<w:numbering xmlns:wpc="http://schemas.microsoft.com/office/word/2010/wordprocessingCanvas" xmlns:cx="http://schemas.microsoft.com/office/drawing/2014/chartex" xmlns:cx1="http://schemas.microsoft.com/office/drawing/2015/9/8/chartex" xmlns:cx2="http://schemas.microsoft.com/office/drawing/2015/10/21/chartex" xmlns:cx3="http://schemas.microsoft.com/office/drawing/2016/5/9/chartex" xmlns:cx4="http://schemas.microsoft.com/office/drawing/2016/5/10/chartex" xmlns:cx5="http://schemas.microsoft.com/office/drawing/2016/5/11/chartex" xmlns:cx6="http://schemas.microsoft.com/office/drawing/2016/5/12/chartex" xmlns:cx7="http://schemas.microsoft.com/office/drawing/2016/5/13/chartex" xmlns:cx8="http://schemas.microsoft.com/office/drawing/2016/5/14/chartex" xmlns:mc="http://schemas.openxmlformats.org/markup-compatibility/2006" xmlns:aink="http://schemas.microsoft.com/office/drawing/2016/ink" xmlns:am3d="http://schemas.microsoft.com/office/drawing/2017/model3d" xmlns:o="urn:schemas-microsoft-com:office:office" xmlns:oel="http://schemas.microsoft.com/office/2019/extlst" xmlns:r="http://schemas.openxmlformats.org/officeDocument/2006/relationships" xmlns:m="http://schemas.openxmlformats.org/officeDocument/2006/math" xmlns:v="urn:schemas-microsoft-com:vml" xmlns:wp14="http://schemas.microsoft.com/office/word/2010/wordprocessingDrawing" xmlns:wp="http://schemas.openxmlformats.org/drawingml/2006/wordprocessingDrawing" xmlns:w10="urn:schemas-microsoft-com:office:word" xmlns:w="http://schemas.openxmlformats.org/wordprocessingml/2006/main" xmlns:w14="http://schemas.microsoft.com/office/word/2010/wordml" xmlns:w15="http://schemas.microsoft.com/office/word/2012/wordml" xmlns:w16cex="http://schemas.microsoft.com/office/word/2018/wordml/cex" xmlns:w16cid="http://schemas.microsoft.com/office/word/2016/wordml/cid" xmlns:w16="http://schemas.microsoft.com/office/word/2018/wordml" xmlns:w16du="http://schemas.microsoft.com/office/word/2023/wordml/word16du" xmlns:w16sdtdh="http://schemas.microsoft.com/office/word/2020/wordml/sdtdatahash" xmlns:w16se="http://schemas.microsoft.com/office/word/2015/wordml/symex" xmlns:wpg="http://schemas.microsoft.com/office/word/2010/wordprocessingGroup" xmlns:wpi="http://schemas.microsoft.com/office/word/2010/wordprocessingInk" xmlns:wne="http://schemas.microsoft.com/office/word/2006/wordml" xmlns:wps="http://schemas.microsoft.com/office/word/2010/wordprocessingShape" mc:Ignorable="w14 w15 w16se w16cid w16 w16cex w16sdtdh w16du wp14">
+<w:numbering xmlns:wpc="http://schemas.microsoft.com/office/word/2010/wordprocessingCanvas" xmlns:cx="http://schemas.microsoft.com/office/drawing/2014/chartex" xmlns:cx1="http://schemas.microsoft.com/office/drawing/2015/9/8/chartex" xmlns:cx2="http://schemas.microsoft.com/office/drawing/2015/10/21/chartex" xmlns:cx3="http://schemas.microsoft.com/office/drawing/2016/5/9/chartex" xmlns:cx4="http://schemas.microsoft.com/office/drawing/2016/5/10/chartex" xmlns:cx5="http://schemas.microsoft.com/office/drawing/2016/5/11/chartex" xmlns:cx6="http://schemas.microsoft.com/office/drawing/2016/5/12/chartex" xmlns:cx7="http://schemas.microsoft.com/office/drawing/2016/5/13/chartex" xmlns:cx8="http://schemas.microsoft.com/office/drawing/2016/5/14/chartex" xmlns:mc="http://schemas.openxmlformats.org/markup-compatibility/2006" xmlns:aink="http://schemas.microsoft.com/office/drawing/2016/ink" xmlns:am3d="http://schemas.microsoft.com/office/drawing/2017/model3d" xmlns:o="urn:schemas-microsoft-com:office:office" xmlns:oel="http://schemas.microsoft.com/office/2019/extlst" xmlns:r="http://schemas.openxmlformats.org/officeDocument/2006/relationships" xmlns:m="http://schemas.openxmlformats.org/officeDocument/2006/math" xmlns:v="urn:schemas-microsoft-com:vml" xmlns:wp14="http://schemas.microsoft.com/office/word/2010/wordprocessingDrawing" xmlns:wp="http://schemas.openxmlformats.org/drawingml/2006/wordprocessingDrawing" xmlns:w10="urn:schemas-microsoft-com:office:word" xmlns:w="http://schemas.openxmlformats.org/wordprocessingml/2006/main" xmlns:w14="http://schemas.microsoft.com/office/word/2010/wordml" xmlns:w15="http://schemas.microsoft.com/office/word/2012/wordml" xmlns:w16cex="http://schemas.microsoft.com/office/word/2018/wordml/cex" xmlns:w16cid="http://schemas.microsoft.com/office/word/2016/wordml/cid" xmlns:w16="http://schemas.microsoft.com/office/word/2018/wordml" xmlns:w16du="http://schemas.microsoft.com/office/word/2023/wordml/word16du" xmlns:w16sdtdh="http://schemas.microsoft.com/office/word/2020/wordml/sdtdatahash" xmlns:w16sdtfl="http://schemas.microsoft.com/office/word/2024/wordml/sdtformatlock" xmlns:w16se="http://schemas.microsoft.com/office/word/2015/wordml/symex" xmlns:wpg="http://schemas.microsoft.com/office/word/2010/wordprocessingGroup" xmlns:wpi="http://schemas.microsoft.com/office/word/2010/wordprocessingInk" xmlns:wne="http://schemas.microsoft.com/office/word/2006/wordml" xmlns:wps="http://schemas.microsoft.com/office/word/2010/wordprocessingShape" mc:Ignorable="w14 w15 w16se w16cid w16 w16cex w16sdtdh w16sdtfl w16du wp14">
   <w:abstractNum w:abstractNumId="0" w15:restartNumberingAfterBreak="0">
     <w:nsid w:val="1E7067B3"/>
     <w:multiLevelType w:val="hybridMultilevel"/>
@@ -4393,7 +4811,7 @@
 </file>
 
 <file path=word/styles.xml><?xml version="1.0" encoding="utf-8"?>
-<w:styles xmlns:mc="http://schemas.openxmlformats.org/markup-compatibility/2006" xmlns:r="http://schemas.openxmlformats.org/officeDocument/2006/relationships" xmlns:w="http://schemas.openxmlformats.org/wordprocessingml/2006/main" xmlns:w14="http://schemas.microsoft.com/office/word/2010/wordml" xmlns:w15="http://schemas.microsoft.com/office/word/2012/wordml" xmlns:w16cex="http://schemas.microsoft.com/office/word/2018/wordml/cex" xmlns:w16cid="http://schemas.microsoft.com/office/word/2016/wordml/cid" xmlns:w16="http://schemas.microsoft.com/office/word/2018/wordml" xmlns:w16du="http://schemas.microsoft.com/office/word/2023/wordml/word16du" xmlns:w16sdtdh="http://schemas.microsoft.com/office/word/2020/wordml/sdtdatahash" xmlns:w16se="http://schemas.microsoft.com/office/word/2015/wordml/symex" mc:Ignorable="w14 w15 w16se w16cid w16 w16cex w16sdtdh w16du">
+<w:styles xmlns:mc="http://schemas.openxmlformats.org/markup-compatibility/2006" xmlns:r="http://schemas.openxmlformats.org/officeDocument/2006/relationships" xmlns:w="http://schemas.openxmlformats.org/wordprocessingml/2006/main" xmlns:w14="http://schemas.microsoft.com/office/word/2010/wordml" xmlns:w15="http://schemas.microsoft.com/office/word/2012/wordml" xmlns:w16cex="http://schemas.microsoft.com/office/word/2018/wordml/cex" xmlns:w16cid="http://schemas.microsoft.com/office/word/2016/wordml/cid" xmlns:w16="http://schemas.microsoft.com/office/word/2018/wordml" xmlns:w16du="http://schemas.microsoft.com/office/word/2023/wordml/word16du" xmlns:w16sdtdh="http://schemas.microsoft.com/office/word/2020/wordml/sdtdatahash" xmlns:w16sdtfl="http://schemas.microsoft.com/office/word/2024/wordml/sdtformatlock" xmlns:w16se="http://schemas.microsoft.com/office/word/2015/wordml/symex" mc:Ignorable="w14 w15 w16se w16cid w16 w16cex w16sdtdh w16sdtfl w16du">
   <w:docDefaults>
     <w:rPrDefault>
       <w:rPr>
@@ -4798,6 +5216,7 @@
   <w:style w:type="character" w:default="1" w:styleId="DefaultParagraphFont">
     <w:name w:val="Default Paragraph Font"/>
     <w:uiPriority w:val="1"/>
+    <w:semiHidden/>
     <w:unhideWhenUsed/>
   </w:style>
   <w:style w:type="table" w:default="1" w:styleId="TableNormal">

</xml_diff>